<commit_message>
v2.1: regenerate combined.docx with SEO/AEO/GEO upgrade
</commit_message>
<xml_diff>
--- a/content-gap-bundle-combined.docx
+++ b/content-gap-bundle-combined.docx
@@ -2,6 +2,32 @@
 <file path=word/document.xml><?xml version="1.0" encoding="utf-8"?>
 <w:document xmlns:w="http://schemas.openxmlformats.org/wordprocessingml/2006/main" xmlns:m="http://schemas.openxmlformats.org/officeDocument/2006/math" xmlns:r="http://schemas.openxmlformats.org/officeDocument/2006/relationships" xmlns:o="urn:schemas-microsoft-com:office:office" xmlns:v="urn:schemas-microsoft-com:vml" xmlns:w10="urn:schemas-microsoft-com:office:word" xmlns:a="http://schemas.openxmlformats.org/drawingml/2006/main" xmlns:pic="http://schemas.openxmlformats.org/drawingml/2006/picture" xmlns:wp="http://schemas.openxmlformats.org/drawingml/2006/wordprocessingDrawing">
   <w:body>
+    <w:sdt>
+      <w:sdtPr>
+        <w:docPartObj>
+          <w:docPartGallery w:val="Table of Contents"/>
+          <w:docPartUnique/>
+        </w:docPartObj>
+      </w:sdtPr>
+      <w:sdtContent>
+        <w:p>
+          <w:pPr>
+            <w:pStyle w:val="TOCHeading"/>
+          </w:pPr>
+          <w:r>
+            <w:t xml:space="preserve">Table of Contents</w:t>
+          </w:r>
+        </w:p>
+        <w:p>
+          <w:r>
+            <w:fldChar w:fldCharType="begin" w:dirty="true"/>
+            <w:instrText xml:space="preserve">TOC \o "1-3" \h \z \u</w:instrText>
+            <w:fldChar w:fldCharType="separate"/>
+            <w:fldChar w:fldCharType="end"/>
+          </w:r>
+        </w:p>
+      </w:sdtContent>
+    </w:sdt>
     <w:p>
       <w:r>
         <w:pict>
@@ -14,6 +40,15 @@
       <w:pPr>
         <w:pStyle w:val="Heading3"/>
       </w:pPr>
+      <w:r>
+        <w:rPr>
+          <w:rStyle w:val="SectionNumber"/>
+        </w:rPr>
+        <w:t xml:space="preserve">0.0.1</w:t>
+      </w:r>
+      <w:r>
+        <w:tab/>
+      </w:r>
       <w:hyperlink r:id="rId9">
         <w:r>
           <w:rPr>
@@ -31,12 +66,21 @@
       </w:r>
     </w:p>
     <w:bookmarkEnd w:id="10"/>
-    <w:bookmarkStart w:id="69" w:name="content-gap-aeo-opportunity-playbook"/>
+    <w:bookmarkStart w:id="58" w:name="content-gap-aeo-opportunity-playbook"/>
     <w:p>
       <w:pPr>
         <w:pStyle w:val="Heading1"/>
       </w:pPr>
       <w:r>
+        <w:rPr>
+          <w:rStyle w:val="SectionNumber"/>
+        </w:rPr>
+        <w:t xml:space="preserve">1</w:t>
+      </w:r>
+      <w:r>
+        <w:tab/>
+      </w:r>
+      <w:r>
         <w:t xml:space="preserve">Content Gap + AEO Opportunity Playbook</w:t>
       </w:r>
     </w:p>
@@ -45,6 +89,15 @@
       <w:pPr>
         <w:pStyle w:val="Heading2"/>
       </w:pPr>
+      <w:r>
+        <w:rPr>
+          <w:rStyle w:val="SectionNumber"/>
+        </w:rPr>
+        <w:t xml:space="preserve">1.1</w:t>
+      </w:r>
+      <w:r>
+        <w:tab/>
+      </w:r>
       <w:r>
         <w:t xml:space="preserve">A content gap analysis that surfaces the exact 20 to 50 keywords your competitors rank for that you don’t, the 30 to 50 questions ChatGPT and Perplexity cite competitors on while ignoring you, and the intent-mapped topic clusters your content programme should pursue next. Delivered as a Word doc plus the markdown source with 10 full content briefs ready to hand to a writer. Built by Nishant Kapoor at EntireCommerce AI.</w:t>
       </w:r>
@@ -62,6 +115,15 @@
         <w:pStyle w:val="Heading3"/>
       </w:pPr>
       <w:r>
+        <w:rPr>
+          <w:rStyle w:val="SectionNumber"/>
+        </w:rPr>
+        <w:t xml:space="preserve">1.1.1</w:t>
+      </w:r>
+      <w:r>
+        <w:tab/>
+      </w:r>
+      <w:r>
         <w:t xml:space="preserve">Fastest way to use this playbook</w:t>
       </w:r>
     </w:p>
@@ -116,6 +178,15 @@
         <w:pStyle w:val="Heading2"/>
       </w:pPr>
       <w:r>
+        <w:rPr>
+          <w:rStyle w:val="SectionNumber"/>
+        </w:rPr>
+        <w:t xml:space="preserve">1.2</w:t>
+      </w:r>
+      <w:r>
+        <w:tab/>
+      </w:r>
+      <w:r>
         <w:t xml:space="preserve">Who This Playbook Is For</w:t>
       </w:r>
     </w:p>
@@ -227,6 +298,15 @@
         <w:pStyle w:val="Heading2"/>
       </w:pPr>
       <w:r>
+        <w:rPr>
+          <w:rStyle w:val="SectionNumber"/>
+        </w:rPr>
+        <w:t xml:space="preserve">1.3</w:t>
+      </w:r>
+      <w:r>
+        <w:tab/>
+      </w:r>
+      <w:r>
         <w:t xml:space="preserve">What The Content Gap Playbook Actually Is</w:t>
       </w:r>
     </w:p>
@@ -379,6 +459,15 @@
         <w:pStyle w:val="Heading2"/>
       </w:pPr>
       <w:r>
+        <w:rPr>
+          <w:rStyle w:val="SectionNumber"/>
+        </w:rPr>
+        <w:t xml:space="preserve">1.4</w:t>
+      </w:r>
+      <w:r>
+        <w:tab/>
+      </w:r>
+      <w:r>
         <w:t xml:space="preserve">Setup (15 Minutes)</w:t>
       </w:r>
     </w:p>
@@ -387,6 +476,15 @@
       <w:pPr>
         <w:pStyle w:val="Heading3"/>
       </w:pPr>
+      <w:r>
+        <w:rPr>
+          <w:rStyle w:val="SectionNumber"/>
+        </w:rPr>
+        <w:t xml:space="preserve">1.4.1</w:t>
+      </w:r>
+      <w:r>
+        <w:tab/>
+      </w:r>
       <w:r>
         <w:t xml:space="preserve">Prerequisites</w:t>
       </w:r>
@@ -499,6 +597,15 @@
       <w:pPr>
         <w:pStyle w:val="Heading3"/>
       </w:pPr>
+      <w:r>
+        <w:rPr>
+          <w:rStyle w:val="SectionNumber"/>
+        </w:rPr>
+        <w:t xml:space="preserve">1.4.2</w:t>
+      </w:r>
+      <w:r>
+        <w:tab/>
+      </w:r>
       <w:r>
         <w:t xml:space="preserve">Cost overview</w:t>
       </w:r>
@@ -933,6 +1040,15 @@
         <w:pStyle w:val="Heading3"/>
       </w:pPr>
       <w:r>
+        <w:rPr>
+          <w:rStyle w:val="SectionNumber"/>
+        </w:rPr>
+        <w:t xml:space="preserve">1.4.3</w:t>
+      </w:r>
+      <w:r>
+        <w:tab/>
+      </w:r>
+      <w:r>
         <w:t xml:space="preserve">Step 1: Create the project folder</w:t>
       </w:r>
     </w:p>
@@ -992,6 +1108,15 @@
         <w:pStyle w:val="Heading3"/>
       </w:pPr>
       <w:r>
+        <w:rPr>
+          <w:rStyle w:val="SectionNumber"/>
+        </w:rPr>
+        <w:t xml:space="preserve">1.4.4</w:t>
+      </w:r>
+      <w:r>
+        <w:tab/>
+      </w:r>
+      <w:r>
         <w:t xml:space="preserve">Step 2: Set up your .env</w:t>
       </w:r>
     </w:p>
@@ -1158,6 +1283,15 @@
         <w:pStyle w:val="Heading3"/>
       </w:pPr>
       <w:r>
+        <w:rPr>
+          <w:rStyle w:val="SectionNumber"/>
+        </w:rPr>
+        <w:t xml:space="preserve">1.4.5</w:t>
+      </w:r>
+      <w:r>
+        <w:tab/>
+      </w:r>
+      <w:r>
         <w:t xml:space="preserve">Step 3: Populate CLAUDE.md (or let Claude interview you)</w:t>
       </w:r>
     </w:p>
@@ -1274,6 +1408,15 @@
       <w:pPr>
         <w:pStyle w:val="Heading3"/>
       </w:pPr>
+      <w:r>
+        <w:rPr>
+          <w:rStyle w:val="SectionNumber"/>
+        </w:rPr>
+        <w:t xml:space="preserve">1.4.6</w:t>
+      </w:r>
+      <w:r>
+        <w:tab/>
+      </w:r>
       <w:r>
         <w:t xml:space="preserve">Step 4: Open Claude Code in the folder</w:t>
       </w:r>
@@ -1339,6 +1482,15 @@
         <w:pStyle w:val="Heading2"/>
       </w:pPr>
       <w:r>
+        <w:rPr>
+          <w:rStyle w:val="SectionNumber"/>
+        </w:rPr>
+        <w:t xml:space="preserve">1.5</w:t>
+      </w:r>
+      <w:r>
+        <w:tab/>
+      </w:r>
+      <w:r>
         <w:t xml:space="preserve">The Three Files in This Bundle</w:t>
       </w:r>
     </w:p>
@@ -1347,6 +1499,15 @@
       <w:pPr>
         <w:pStyle w:val="Heading3"/>
       </w:pPr>
+      <w:r>
+        <w:rPr>
+          <w:rStyle w:val="SectionNumber"/>
+        </w:rPr>
+        <w:t xml:space="preserve">1.5.1</w:t>
+      </w:r>
+      <w:r>
+        <w:tab/>
+      </w:r>
       <w:r>
         <w:t xml:space="preserve">File 1: CLAUDE.md (business-briefing template)</w:t>
       </w:r>
@@ -1426,6 +1587,15 @@
         <w:pStyle w:val="Heading3"/>
       </w:pPr>
       <w:r>
+        <w:rPr>
+          <w:rStyle w:val="SectionNumber"/>
+        </w:rPr>
+        <w:t xml:space="preserve">1.5.2</w:t>
+      </w:r>
+      <w:r>
+        <w:tab/>
+      </w:r>
+      <w:r>
         <w:t xml:space="preserve">File 2: content-gap.md (the master prompt Claude runs)</w:t>
       </w:r>
     </w:p>
@@ -1488,6 +1658,15 @@
       <w:pPr>
         <w:pStyle w:val="Heading3"/>
       </w:pPr>
+      <w:r>
+        <w:rPr>
+          <w:rStyle w:val="SectionNumber"/>
+        </w:rPr>
+        <w:t xml:space="preserve">1.5.3</w:t>
+      </w:r>
+      <w:r>
+        <w:tab/>
+      </w:r>
       <w:r>
         <w:t xml:space="preserve">File 3: README.md</w:t>
       </w:r>
@@ -1543,6 +1722,15 @@
       <w:pPr>
         <w:pStyle w:val="Heading2"/>
       </w:pPr>
+      <w:r>
+        <w:rPr>
+          <w:rStyle w:val="SectionNumber"/>
+        </w:rPr>
+        <w:t xml:space="preserve">1.6</w:t>
+      </w:r>
+      <w:r>
+        <w:tab/>
+      </w:r>
       <w:r>
         <w:t xml:space="preserve">Your First Run</w:t>
       </w:r>
@@ -1759,6 +1947,15 @@
         <w:pStyle w:val="Heading2"/>
       </w:pPr>
       <w:r>
+        <w:rPr>
+          <w:rStyle w:val="SectionNumber"/>
+        </w:rPr>
+        <w:t xml:space="preserve">1.7</w:t>
+      </w:r>
+      <w:r>
+        <w:tab/>
+      </w:r>
+      <w:r>
         <w:t xml:space="preserve">What You’ll Get</w:t>
       </w:r>
     </w:p>
@@ -2021,6 +2218,15 @@
       <w:pPr>
         <w:pStyle w:val="Heading2"/>
       </w:pPr>
+      <w:r>
+        <w:rPr>
+          <w:rStyle w:val="SectionNumber"/>
+        </w:rPr>
+        <w:t xml:space="preserve">1.8</w:t>
+      </w:r>
+      <w:r>
+        <w:tab/>
+      </w:r>
       <w:r>
         <w:t xml:space="preserve">Modes</w:t>
       </w:r>
@@ -2273,6 +2479,15 @@
         <w:pStyle w:val="Heading2"/>
       </w:pPr>
       <w:r>
+        <w:rPr>
+          <w:rStyle w:val="SectionNumber"/>
+        </w:rPr>
+        <w:t xml:space="preserve">1.9</w:t>
+      </w:r>
+      <w:r>
+        <w:tab/>
+      </w:r>
+      <w:r>
         <w:t xml:space="preserve">Honest Caveats</w:t>
       </w:r>
     </w:p>
@@ -2415,6 +2630,15 @@
       <w:pPr>
         <w:pStyle w:val="Heading2"/>
       </w:pPr>
+      <w:r>
+        <w:rPr>
+          <w:rStyle w:val="SectionNumber"/>
+        </w:rPr>
+        <w:t xml:space="preserve">1.10</w:t>
+      </w:r>
+      <w:r>
+        <w:tab/>
+      </w:r>
       <w:r>
         <w:t xml:space="preserve">Quick-Start Checklist</w:t>
       </w:r>
@@ -2671,6 +2895,15 @@
       <w:pPr>
         <w:pStyle w:val="Heading2"/>
       </w:pPr>
+      <w:r>
+        <w:rPr>
+          <w:rStyle w:val="SectionNumber"/>
+        </w:rPr>
+        <w:t xml:space="preserve">1.11</w:t>
+      </w:r>
+      <w:r>
+        <w:tab/>
+      </w:r>
       <w:r>
         <w:t xml:space="preserve">Troubleshooting</w:t>
       </w:r>
@@ -3024,6 +3257,15 @@
         <w:pStyle w:val="Heading2"/>
       </w:pPr>
       <w:r>
+        <w:rPr>
+          <w:rStyle w:val="SectionNumber"/>
+        </w:rPr>
+        <w:t xml:space="preserve">1.12</w:t>
+      </w:r>
+      <w:r>
+        <w:tab/>
+      </w:r>
+      <w:r>
         <w:t xml:space="preserve">Credit</w:t>
       </w:r>
     </w:p>
@@ -3155,7 +3397,7 @@
         <w:t xml:space="preserve"> </w:t>
       </w:r>
       <w:r>
-        <w:t xml:space="preserve"># Business brief: {Your brand}</w:t>
+        <w:t xml:space="preserve"># Content Gap + AEO Opportunity: Master Prompt</w:t>
       </w:r>
     </w:p>
     <w:p>
@@ -3163,7 +3405,52 @@
         <w:pStyle w:val="BlockText"/>
       </w:pPr>
       <w:r>
-        <w:t xml:space="preserve">This file is the business brief Claude Code loads automatically on every session start. It grounds the Content Gap playbook (and every other playbook) in your brand’s specifics.</w:t>
+        <w:t xml:space="preserve">Paste this entire file into Claude Code from a folder containing a</w:t>
+      </w:r>
+      <w:r>
+        <w:t xml:space="preserve"> </w:t>
+      </w:r>
+      <w:r>
+        <w:rPr>
+          <w:rStyle w:val="VerbatimChar"/>
+        </w:rPr>
+        <w:t xml:space="preserve">.env</w:t>
+      </w:r>
+      <w:r>
+        <w:t xml:space="preserve"> </w:t>
+      </w:r>
+      <w:r>
+        <w:t xml:space="preserve">(your API keys). If a</w:t>
+      </w:r>
+      <w:r>
+        <w:t xml:space="preserve"> </w:t>
+      </w:r>
+      <w:r>
+        <w:rPr>
+          <w:rStyle w:val="VerbatimChar"/>
+        </w:rPr>
+        <w:t xml:space="preserve">CLAUDE.md</w:t>
+      </w:r>
+      <w:r>
+        <w:t xml:space="preserve"> </w:t>
+      </w:r>
+      <w:r>
+        <w:t xml:space="preserve">business brief is already populated, Claude loads it and proceeds. Otherwise Claude interviews you conversationally for the business specifics and writes the</w:t>
+      </w:r>
+      <w:r>
+        <w:t xml:space="preserve"> </w:t>
+      </w:r>
+      <w:r>
+        <w:rPr>
+          <w:rStyle w:val="VerbatimChar"/>
+        </w:rPr>
+        <w:t xml:space="preserve">CLAUDE.md</w:t>
+      </w:r>
+      <w:r>
+        <w:t xml:space="preserve"> </w:t>
+      </w:r>
+      <w:r>
+        <w:t xml:space="preserve">for you. Either way, Claude runs the analysis end-to-end, produces a single consolidated report in markdown and Word formats, and saves supporting data alongside.</w:t>
       </w:r>
     </w:p>
     <w:p>
@@ -3171,62 +3458,7 @@
         <w:pStyle w:val="BlockText"/>
       </w:pPr>
       <w:r>
-        <w:rPr>
-          <w:b/>
-          <w:bCs/>
-        </w:rPr>
-        <w:t xml:space="preserve">Two ways to populate it:</w:t>
-      </w:r>
-    </w:p>
-    <w:p>
-      <w:pPr>
-        <w:pStyle w:val="BlockText"/>
-      </w:pPr>
-      <w:r>
-        <w:rPr>
-          <w:b/>
-          <w:bCs/>
-        </w:rPr>
-        <w:t xml:space="preserve">Option A (fastest, recommended).</w:t>
-      </w:r>
-      <w:r>
-        <w:t xml:space="preserve"> </w:t>
-      </w:r>
-      <w:r>
-        <w:t xml:space="preserve">Leave the file as-is. Run the Content Gap master prompt and Claude will interview you conversationally, ask every question below, and fill in the file as you go. Takes about 10 minutes.</w:t>
-      </w:r>
-    </w:p>
-    <w:p>
-      <w:pPr>
-        <w:pStyle w:val="BlockText"/>
-      </w:pPr>
-      <w:r>
-        <w:rPr>
-          <w:b/>
-          <w:bCs/>
-        </w:rPr>
-        <w:t xml:space="preserve">Option B (DIY).</w:t>
-      </w:r>
-      <w:r>
-        <w:t xml:space="preserve"> </w:t>
-      </w:r>
-      <w:r>
-        <w:t xml:space="preserve">Fill in every</w:t>
-      </w:r>
-      <w:r>
-        <w:t xml:space="preserve"> </w:t>
-      </w:r>
-      <w:r>
-        <w:rPr>
-          <w:rStyle w:val="VerbatimChar"/>
-        </w:rPr>
-        <w:t xml:space="preserve">{placeholder}</w:t>
-      </w:r>
-      <w:r>
-        <w:t xml:space="preserve"> </w:t>
-      </w:r>
-      <w:r>
-        <w:t xml:space="preserve">yourself before running the analysis. One to two sentences per field. Founder voice over marketing copy.</w:t>
+        <w:t xml:space="preserve">Built by Nishant Kapoor at EntireCommerce AI. Version 1, April 2026.</w:t>
       </w:r>
     </w:p>
     <w:p>
@@ -3236,14 +3468,346 @@
         </w:pict>
       </w:r>
     </w:p>
+    <w:p>
+      <w:pPr>
+        <w:pStyle w:val="FirstParagraph"/>
+      </w:pPr>
+      <w:r>
+        <w:t xml:space="preserve">You are executing the Content Gap + AEO Opportunity playbook for the brand in the current working directory. Follow these steps in order. Do not skip steps. Do not invent data. Honour the voice conventions in Step 6.</w:t>
+      </w:r>
+    </w:p>
+    <w:p>
+      <w:r>
+        <w:pict>
+          <v:rect style="width:0;height:1.5pt" o:hralign="center" o:hrstd="t" o:hr="t"/>
+        </w:pict>
+      </w:r>
+    </w:p>
     <w:bookmarkEnd w:id="34"/>
-    <w:bookmarkStart w:id="35" w:name="brand-overview"/>
+    <w:bookmarkStart w:id="37" w:name="X984eac9891fea7dcd5834405f0d4b876161ed1c"/>
     <w:p>
       <w:pPr>
         <w:pStyle w:val="Heading2"/>
       </w:pPr>
       <w:r>
-        <w:t xml:space="preserve">Brand overview</w:t>
+        <w:rPr>
+          <w:rStyle w:val="SectionNumber"/>
+        </w:rPr>
+        <w:t xml:space="preserve">1.13</w:t>
+      </w:r>
+      <w:r>
+        <w:tab/>
+      </w:r>
+      <w:r>
+        <w:t xml:space="preserve">Step 1. Load or populate the business brief</w:t>
+      </w:r>
+    </w:p>
+    <w:p>
+      <w:pPr>
+        <w:pStyle w:val="FirstParagraph"/>
+      </w:pPr>
+      <w:r>
+        <w:t xml:space="preserve">Look for</w:t>
+      </w:r>
+      <w:r>
+        <w:t xml:space="preserve"> </w:t>
+      </w:r>
+      <w:r>
+        <w:rPr>
+          <w:rStyle w:val="VerbatimChar"/>
+        </w:rPr>
+        <w:t xml:space="preserve">CLAUDE.md</w:t>
+      </w:r>
+      <w:r>
+        <w:t xml:space="preserve"> </w:t>
+      </w:r>
+      <w:r>
+        <w:t xml:space="preserve">in the current working directory.</w:t>
+      </w:r>
+    </w:p>
+    <w:p>
+      <w:pPr>
+        <w:pStyle w:val="BodyText"/>
+      </w:pPr>
+      <w:r>
+        <w:rPr>
+          <w:b/>
+          <w:bCs/>
+        </w:rPr>
+        <w:t xml:space="preserve">If</w:t>
+      </w:r>
+      <w:r>
+        <w:rPr>
+          <w:b/>
+          <w:bCs/>
+        </w:rPr>
+        <w:t xml:space="preserve"> </w:t>
+      </w:r>
+      <w:r>
+        <w:rPr>
+          <w:rStyle w:val="VerbatimChar"/>
+          <w:b/>
+          <w:bCs/>
+        </w:rPr>
+        <w:t xml:space="preserve">CLAUDE.md</w:t>
+      </w:r>
+      <w:r>
+        <w:rPr>
+          <w:b/>
+          <w:bCs/>
+        </w:rPr>
+        <w:t xml:space="preserve"> </w:t>
+      </w:r>
+      <w:r>
+        <w:rPr>
+          <w:b/>
+          <w:bCs/>
+        </w:rPr>
+        <w:t xml:space="preserve">exists and is fully filled in</w:t>
+      </w:r>
+      <w:r>
+        <w:t xml:space="preserve"> </w:t>
+      </w:r>
+      <w:r>
+        <w:t xml:space="preserve">(no</w:t>
+      </w:r>
+      <w:r>
+        <w:t xml:space="preserve"> </w:t>
+      </w:r>
+      <w:r>
+        <w:rPr>
+          <w:rStyle w:val="VerbatimChar"/>
+        </w:rPr>
+        <w:t xml:space="preserve">{placeholder}</w:t>
+      </w:r>
+      <w:r>
+        <w:t xml:space="preserve"> </w:t>
+      </w:r>
+      <w:r>
+        <w:t xml:space="preserve">text remaining, required fields populated), read it and proceed to Step 2.</w:t>
+      </w:r>
+    </w:p>
+    <w:p>
+      <w:pPr>
+        <w:pStyle w:val="BodyText"/>
+      </w:pPr>
+      <w:r>
+        <w:rPr>
+          <w:b/>
+          <w:bCs/>
+        </w:rPr>
+        <w:t xml:space="preserve">If</w:t>
+      </w:r>
+      <w:r>
+        <w:rPr>
+          <w:b/>
+          <w:bCs/>
+        </w:rPr>
+        <w:t xml:space="preserve"> </w:t>
+      </w:r>
+      <w:r>
+        <w:rPr>
+          <w:rStyle w:val="VerbatimChar"/>
+          <w:b/>
+          <w:bCs/>
+        </w:rPr>
+        <w:t xml:space="preserve">CLAUDE.md</w:t>
+      </w:r>
+      <w:r>
+        <w:rPr>
+          <w:b/>
+          <w:bCs/>
+        </w:rPr>
+        <w:t xml:space="preserve"> </w:t>
+      </w:r>
+      <w:r>
+        <w:rPr>
+          <w:b/>
+          <w:bCs/>
+        </w:rPr>
+        <w:t xml:space="preserve">does not exist, contains placeholder text, or is missing required fields, run the business-brief interview before proceeding.</w:t>
+      </w:r>
+      <w:r>
+        <w:t xml:space="preserve"> </w:t>
+      </w:r>
+      <w:r>
+        <w:t xml:space="preserve">Do not skip. Do not guess.</w:t>
+      </w:r>
+    </w:p>
+    <w:bookmarkStart w:id="35" w:name="the-business-brief-interview"/>
+    <w:p>
+      <w:pPr>
+        <w:pStyle w:val="Heading3"/>
+      </w:pPr>
+      <w:r>
+        <w:rPr>
+          <w:rStyle w:val="SectionNumber"/>
+        </w:rPr>
+        <w:t xml:space="preserve">1.13.1</w:t>
+      </w:r>
+      <w:r>
+        <w:tab/>
+      </w:r>
+      <w:r>
+        <w:t xml:space="preserve">The business-brief interview</w:t>
+      </w:r>
+    </w:p>
+    <w:p>
+      <w:pPr>
+        <w:pStyle w:val="FirstParagraph"/>
+      </w:pPr>
+      <w:r>
+        <w:t xml:space="preserve">Ask the user these questions conversationally, one batch at a time. Write the answers into</w:t>
+      </w:r>
+      <w:r>
+        <w:t xml:space="preserve"> </w:t>
+      </w:r>
+      <w:r>
+        <w:rPr>
+          <w:rStyle w:val="VerbatimChar"/>
+        </w:rPr>
+        <w:t xml:space="preserve">CLAUDE.md</w:t>
+      </w:r>
+      <w:r>
+        <w:t xml:space="preserve"> </w:t>
+      </w:r>
+      <w:r>
+        <w:t xml:space="preserve">progressively (create the file if missing) and confirm before moving on.</w:t>
+      </w:r>
+    </w:p>
+    <w:p>
+      <w:pPr>
+        <w:pStyle w:val="BodyText"/>
+      </w:pPr>
+      <w:r>
+        <w:rPr>
+          <w:b/>
+          <w:bCs/>
+        </w:rPr>
+        <w:t xml:space="preserve">Batch 1: Brand overview.</w:t>
+      </w:r>
+      <w:r>
+        <w:t xml:space="preserve"> </w:t>
+      </w:r>
+      <w:r>
+        <w:t xml:space="preserve">Brand name. Primary URL. Domain age. Ecommerce platform. Geographic focus. Stage.</w:t>
+      </w:r>
+    </w:p>
+    <w:p>
+      <w:pPr>
+        <w:pStyle w:val="BodyText"/>
+      </w:pPr>
+      <w:r>
+        <w:rPr>
+          <w:b/>
+          <w:bCs/>
+        </w:rPr>
+        <w:t xml:space="preserve">Batch 2: Product and audience.</w:t>
+      </w:r>
+      <w:r>
+        <w:t xml:space="preserve"> </w:t>
+      </w:r>
+      <w:r>
+        <w:t xml:space="preserve">What you sell in one sentence. Price range or AOV. Catalog size. Core buyer in one sentence. Where they hang out online.</w:t>
+      </w:r>
+    </w:p>
+    <w:p>
+      <w:pPr>
+        <w:pStyle w:val="BodyText"/>
+      </w:pPr>
+      <w:r>
+        <w:rPr>
+          <w:b/>
+          <w:bCs/>
+        </w:rPr>
+        <w:t xml:space="preserve">Batch 3: Current content footprint.</w:t>
+      </w:r>
+      <w:r>
+        <w:t xml:space="preserve"> </w:t>
+      </w:r>
+      <w:r>
+        <w:t xml:space="preserve">Blog or long-form presence. Monthly organic traffic band. Active topic clusters (if any). Publishing cadence. Team producing content.</w:t>
+      </w:r>
+    </w:p>
+    <w:p>
+      <w:pPr>
+        <w:pStyle w:val="BodyText"/>
+      </w:pPr>
+      <w:r>
+        <w:rPr>
+          <w:b/>
+          <w:bCs/>
+        </w:rPr>
+        <w:t xml:space="preserve">Batch 4: Positioning.</w:t>
+      </w:r>
+      <w:r>
+        <w:t xml:space="preserve"> </w:t>
+      </w:r>
+      <w:r>
+        <w:t xml:space="preserve">Why you win. Three to five competitor URLs. Pricing tier vs category median.</w:t>
+      </w:r>
+    </w:p>
+    <w:p>
+      <w:pPr>
+        <w:pStyle w:val="BodyText"/>
+      </w:pPr>
+      <w:r>
+        <w:rPr>
+          <w:b/>
+          <w:bCs/>
+        </w:rPr>
+        <w:t xml:space="preserve">Batch 5: AEO priorities.</w:t>
+      </w:r>
+      <w:r>
+        <w:t xml:space="preserve"> </w:t>
+      </w:r>
+      <w:r>
+        <w:t xml:space="preserve">Which LLM the ICP uses most. Current AEO presence suspicion. Three to five category questions you hear from customers.</w:t>
+      </w:r>
+    </w:p>
+    <w:p>
+      <w:pPr>
+        <w:pStyle w:val="BodyText"/>
+      </w:pPr>
+      <w:r>
+        <w:rPr>
+          <w:b/>
+          <w:bCs/>
+        </w:rPr>
+        <w:t xml:space="preserve">Batch 6: Tool stack and constraints.</w:t>
+      </w:r>
+      <w:r>
+        <w:t xml:space="preserve"> </w:t>
+      </w:r>
+      <w:r>
+        <w:t xml:space="preserve">Website / CMS. GSC property. SEO tools. Publishing velocity ceiling. Subject-matter expertise access. 12-month organic traffic goal. Primary outcome the content must drive.</w:t>
+      </w:r>
+    </w:p>
+    <w:bookmarkEnd w:id="35"/>
+    <w:bookmarkStart w:id="36" w:name="minimum-required-to-proceed-to-step-2"/>
+    <w:p>
+      <w:pPr>
+        <w:pStyle w:val="Heading3"/>
+      </w:pPr>
+      <w:r>
+        <w:rPr>
+          <w:rStyle w:val="SectionNumber"/>
+        </w:rPr>
+        <w:t xml:space="preserve">1.13.2</w:t>
+      </w:r>
+      <w:r>
+        <w:tab/>
+      </w:r>
+      <w:r>
+        <w:t xml:space="preserve">Minimum required to proceed to Step 2</w:t>
+      </w:r>
+    </w:p>
+    <w:p>
+      <w:pPr>
+        <w:pStyle w:val="FirstParagraph"/>
+      </w:pPr>
+      <w:r>
+        <w:t xml:space="preserve">If after the interview you do not have these seven fields, ask again:</w:t>
       </w:r>
     </w:p>
     <w:p>
@@ -3255,14 +3819,7 @@
         </w:numPr>
       </w:pPr>
       <w:r>
-        <w:rPr>
-          <w:b/>
-          <w:bCs/>
-        </w:rPr>
         <w:t xml:space="preserve">Brand name</w:t>
-      </w:r>
-      <w:r>
-        <w:t xml:space="preserve">: {Your brand name}</w:t>
       </w:r>
     </w:p>
     <w:p>
@@ -3274,14 +3831,7 @@
         </w:numPr>
       </w:pPr>
       <w:r>
-        <w:rPr>
-          <w:b/>
-          <w:bCs/>
-        </w:rPr>
         <w:t xml:space="preserve">Primary URL</w:t>
-      </w:r>
-      <w:r>
-        <w:t xml:space="preserve">: {https://yourbrand.com}</w:t>
       </w:r>
     </w:p>
     <w:p>
@@ -3293,32 +3843,7 @@
         </w:numPr>
       </w:pPr>
       <w:r>
-        <w:rPr>
-          <w:b/>
-          <w:bCs/>
-        </w:rPr>
-        <w:t xml:space="preserve">Domain age</w:t>
-      </w:r>
-      <w:r>
-        <w:t xml:space="preserve">: {e.g. </w:t>
-      </w:r>
-      <w:r>
-        <w:t xml:space="preserve">“launched Jan 2024”</w:t>
-      </w:r>
-      <w:r>
-        <w:t xml:space="preserve"> </w:t>
-      </w:r>
-      <w:r>
-        <w:t xml:space="preserve">or</w:t>
-      </w:r>
-      <w:r>
-        <w:t xml:space="preserve"> </w:t>
-      </w:r>
-      <w:r>
-        <w:t xml:space="preserve">“six years”</w:t>
-      </w:r>
-      <w:r>
-        <w:t xml:space="preserve">}</w:t>
+        <w:t xml:space="preserve">What the brand sells (one sentence)</w:t>
       </w:r>
     </w:p>
     <w:p>
@@ -3330,14 +3855,7 @@
         </w:numPr>
       </w:pPr>
       <w:r>
-        <w:rPr>
-          <w:b/>
-          <w:bCs/>
-        </w:rPr>
-        <w:t xml:space="preserve">Ecommerce platform</w:t>
-      </w:r>
-      <w:r>
-        <w:t xml:space="preserve">: {Shopify / WooCommerce / Custom / etc.}</w:t>
+        <w:t xml:space="preserve">Core buyer (one sentence)</w:t>
       </w:r>
     </w:p>
     <w:p>
@@ -3349,14 +3867,7 @@
         </w:numPr>
       </w:pPr>
       <w:r>
-        <w:rPr>
-          <w:b/>
-          <w:bCs/>
-        </w:rPr>
-        <w:t xml:space="preserve">Geographic focus</w:t>
-      </w:r>
-      <w:r>
-        <w:t xml:space="preserve">: {US, UK, EU, global, etc.}</w:t>
+        <w:t xml:space="preserve">Three to five competitor URLs</w:t>
       </w:r>
     </w:p>
     <w:p>
@@ -3368,24 +3879,7 @@
         </w:numPr>
       </w:pPr>
       <w:r>
-        <w:rPr>
-          <w:b/>
-          <w:bCs/>
-        </w:rPr>
-        <w:t xml:space="preserve">Stage</w:t>
-      </w:r>
-      <w:r>
-        <w:t xml:space="preserve">: {Pre-launch / first year / established with trading history / mature}</w:t>
-      </w:r>
-    </w:p>
-    <w:bookmarkEnd w:id="35"/>
-    <w:bookmarkStart w:id="36" w:name="product"/>
-    <w:p>
-      <w:pPr>
-        <w:pStyle w:val="Heading2"/>
-      </w:pPr>
-      <w:r>
-        <w:t xml:space="preserve">Product</w:t>
+        <w:t xml:space="preserve">Monthly organic traffic band</w:t>
       </w:r>
     </w:p>
     <w:p>
@@ -3393,211 +3887,25 @@
         <w:pStyle w:val="Compact"/>
         <w:numPr>
           <w:ilvl w:val="0"/>
-          <w:numId w:val="1020"/>
+          <w:numId w:val="1019"/>
         </w:numPr>
       </w:pPr>
       <w:r>
-        <w:rPr>
-          <w:b/>
-          <w:bCs/>
-        </w:rPr>
-        <w:t xml:space="preserve">What you sell (one sentence)</w:t>
-      </w:r>
-      <w:r>
-        <w:t xml:space="preserve">: {e.g. </w:t>
-      </w:r>
-      <w:r>
-        <w:t xml:space="preserve">“Launch-monitor-backed short-game training systems for club golfers working on wedge consistency.”</w:t>
-      </w:r>
-      <w:r>
-        <w:t xml:space="preserve">}</w:t>
-      </w:r>
-    </w:p>
-    <w:p>
-      <w:pPr>
-        <w:pStyle w:val="Compact"/>
-        <w:numPr>
-          <w:ilvl w:val="0"/>
-          <w:numId w:val="1020"/>
-        </w:numPr>
-      </w:pPr>
-      <w:r>
-        <w:rPr>
-          <w:b/>
-          <w:bCs/>
-        </w:rPr>
-        <w:t xml:space="preserve">Price range</w:t>
-      </w:r>
-      <w:r>
-        <w:t xml:space="preserve">: {e.g. </w:t>
-      </w:r>
-      <w:r>
-        <w:t xml:space="preserve">“£500 to £1,200. AOV £650.”</w:t>
-      </w:r>
-      <w:r>
-        <w:t xml:space="preserve">}</w:t>
-      </w:r>
-    </w:p>
-    <w:p>
-      <w:pPr>
-        <w:pStyle w:val="Compact"/>
-        <w:numPr>
-          <w:ilvl w:val="0"/>
-          <w:numId w:val="1020"/>
-        </w:numPr>
-      </w:pPr>
-      <w:r>
-        <w:rPr>
-          <w:b/>
-          <w:bCs/>
-        </w:rPr>
-        <w:t xml:space="preserve">Catalog size</w:t>
-      </w:r>
-      <w:r>
-        <w:t xml:space="preserve">: {Number of active SKUs}</w:t>
-      </w:r>
-    </w:p>
-    <w:p>
-      <w:pPr>
-        <w:pStyle w:val="Compact"/>
-        <w:numPr>
-          <w:ilvl w:val="0"/>
-          <w:numId w:val="1020"/>
-        </w:numPr>
-      </w:pPr>
-      <w:r>
-        <w:rPr>
-          <w:b/>
-          <w:bCs/>
-        </w:rPr>
-        <w:t xml:space="preserve">Distinctive or patented elements</w:t>
-      </w:r>
-      <w:r>
-        <w:t xml:space="preserve">: {What makes this product materially different from alternatives}</w:t>
-      </w:r>
-    </w:p>
-    <w:bookmarkEnd w:id="36"/>
-    <w:bookmarkStart w:id="37" w:name="target-audience"/>
-    <w:p>
-      <w:pPr>
-        <w:pStyle w:val="Heading2"/>
-      </w:pPr>
-      <w:r>
-        <w:t xml:space="preserve">Target audience</w:t>
-      </w:r>
-    </w:p>
-    <w:p>
-      <w:pPr>
-        <w:pStyle w:val="Compact"/>
-        <w:numPr>
-          <w:ilvl w:val="0"/>
-          <w:numId w:val="1021"/>
-        </w:numPr>
-      </w:pPr>
-      <w:r>
-        <w:rPr>
-          <w:b/>
-          <w:bCs/>
-        </w:rPr>
-        <w:t xml:space="preserve">Core buyer (one sentence)</w:t>
-      </w:r>
-      <w:r>
-        <w:t xml:space="preserve">: {e.g. </w:t>
-      </w:r>
-      <w:r>
-        <w:t xml:space="preserve">“Club golfers in the US aged 35 to 55 frustrated by inconsistent wedge distances inside 100 yards.”</w:t>
-      </w:r>
-      <w:r>
-        <w:t xml:space="preserve">}</w:t>
-      </w:r>
-    </w:p>
-    <w:p>
-      <w:pPr>
-        <w:pStyle w:val="Compact"/>
-        <w:numPr>
-          <w:ilvl w:val="0"/>
-          <w:numId w:val="1021"/>
-        </w:numPr>
-      </w:pPr>
-      <w:r>
-        <w:rPr>
-          <w:b/>
-          <w:bCs/>
-        </w:rPr>
-        <w:t xml:space="preserve">Secondary buyer</w:t>
-      </w:r>
-      <w:r>
-        <w:t xml:space="preserve">: {Second segment if material}</w:t>
-      </w:r>
-    </w:p>
-    <w:p>
-      <w:pPr>
-        <w:pStyle w:val="Compact"/>
-        <w:numPr>
-          <w:ilvl w:val="0"/>
-          <w:numId w:val="1021"/>
-        </w:numPr>
-      </w:pPr>
-      <w:r>
-        <w:rPr>
-          <w:b/>
-          <w:bCs/>
-        </w:rPr>
-        <w:t xml:space="preserve">What they hire you to do</w:t>
-      </w:r>
-      <w:r>
-        <w:t xml:space="preserve">: {The functional, emotional, and social jobs your product solves}</w:t>
-      </w:r>
-    </w:p>
-    <w:p>
-      <w:pPr>
-        <w:pStyle w:val="Compact"/>
-        <w:numPr>
-          <w:ilvl w:val="0"/>
-          <w:numId w:val="1021"/>
-        </w:numPr>
-      </w:pPr>
-      <w:r>
-        <w:rPr>
-          <w:b/>
-          <w:bCs/>
-        </w:rPr>
-        <w:t xml:space="preserve">Where they hang out online</w:t>
-      </w:r>
-      <w:r>
-        <w:t xml:space="preserve">: {Reddit subs, niche forums, YouTube channels, podcasts}</w:t>
-      </w:r>
-    </w:p>
-    <w:bookmarkEnd w:id="37"/>
-    <w:bookmarkStart w:id="38" w:name="current-content-footprint"/>
-    <w:p>
-      <w:pPr>
-        <w:pStyle w:val="Heading2"/>
-      </w:pPr>
-      <w:r>
-        <w:t xml:space="preserve">Current content footprint</w:t>
-      </w:r>
-    </w:p>
-    <w:p>
-      <w:pPr>
-        <w:pStyle w:val="Compact"/>
-        <w:numPr>
-          <w:ilvl w:val="0"/>
-          <w:numId w:val="1022"/>
-        </w:numPr>
-      </w:pPr>
-      <w:r>
-        <w:rPr>
-          <w:b/>
-          <w:bCs/>
-        </w:rPr>
-        <w:t xml:space="preserve">Blog or long-form presence</w:t>
-      </w:r>
-      <w:r>
-        <w:t xml:space="preserve">: {e.g. </w:t>
-      </w:r>
-      <w:r>
-        <w:t xml:space="preserve">“12 posts on Shopify blog, published 2024, no structured clusters”</w:t>
+        <w:t xml:space="preserve">Which LLM the ICP uses most</w:t>
+      </w:r>
+    </w:p>
+    <w:p>
+      <w:pPr>
+        <w:pStyle w:val="FirstParagraph"/>
+      </w:pPr>
+      <w:r>
+        <w:t xml:space="preserve">Optional fields can be marked</w:t>
+      </w:r>
+      <w:r>
+        <w:t xml:space="preserve"> </w:t>
+      </w:r>
+      <w:r>
+        <w:t xml:space="preserve">“unknown”</w:t>
       </w:r>
       <w:r>
         <w:t xml:space="preserve"> </w:t>
@@ -3609,854 +3917,10 @@
         <w:t xml:space="preserve"> </w:t>
       </w:r>
       <w:r>
-        <w:t xml:space="preserve">“zero content, pre-launch”</w:t>
-      </w:r>
-      <w:r>
-        <w:t xml:space="preserve">}</w:t>
-      </w:r>
-    </w:p>
-    <w:p>
-      <w:pPr>
-        <w:pStyle w:val="Compact"/>
-        <w:numPr>
-          <w:ilvl w:val="0"/>
-          <w:numId w:val="1022"/>
-        </w:numPr>
-      </w:pPr>
-      <w:r>
-        <w:rPr>
-          <w:b/>
-          <w:bCs/>
-        </w:rPr>
-        <w:t xml:space="preserve">Monthly organic traffic band</w:t>
-      </w:r>
-      <w:r>
-        <w:t xml:space="preserve">: {</w:t>
-      </w:r>
-      <w:r>
-        <w:t xml:space="preserve">“under 1,000”</w:t>
-      </w:r>
-      <w:r>
-        <w:t xml:space="preserve">,</w:t>
-      </w:r>
-      <w:r>
-        <w:t xml:space="preserve"> </w:t>
-      </w:r>
-      <w:r>
-        <w:t xml:space="preserve">“1k to 10k”</w:t>
-      </w:r>
-      <w:r>
-        <w:t xml:space="preserve">,</w:t>
-      </w:r>
-      <w:r>
-        <w:t xml:space="preserve"> </w:t>
-      </w:r>
-      <w:r>
-        <w:t xml:space="preserve">“10k to 50k”</w:t>
-      </w:r>
-      <w:r>
-        <w:t xml:space="preserve">,</w:t>
-      </w:r>
-      <w:r>
-        <w:t xml:space="preserve"> </w:t>
-      </w:r>
-      <w:r>
-        <w:t xml:space="preserve">“50k+”</w:t>
-      </w:r>
-      <w:r>
-        <w:t xml:space="preserve">}</w:t>
-      </w:r>
-    </w:p>
-    <w:p>
-      <w:pPr>
-        <w:pStyle w:val="Compact"/>
-        <w:numPr>
-          <w:ilvl w:val="0"/>
-          <w:numId w:val="1022"/>
-        </w:numPr>
-      </w:pPr>
-      <w:r>
-        <w:rPr>
-          <w:b/>
-          <w:bCs/>
-        </w:rPr>
-        <w:t xml:space="preserve">Active topic clusters</w:t>
-      </w:r>
-      <w:r>
-        <w:t xml:space="preserve">: {e.g. </w:t>
-      </w:r>
-      <w:r>
-        <w:t xml:space="preserve">“technique, equipment, practice”</w:t>
-      </w:r>
-      <w:r>
-        <w:t xml:space="preserve"> </w:t>
-      </w:r>
-      <w:r>
-        <w:t xml:space="preserve">or</w:t>
-      </w:r>
-      <w:r>
-        <w:t xml:space="preserve"> </w:t>
-      </w:r>
-      <w:r>
-        <w:t xml:space="preserve">“none, flat blog”</w:t>
-      </w:r>
-      <w:r>
-        <w:t xml:space="preserve">}</w:t>
-      </w:r>
-    </w:p>
-    <w:p>
-      <w:pPr>
-        <w:pStyle w:val="Compact"/>
-        <w:numPr>
-          <w:ilvl w:val="0"/>
-          <w:numId w:val="1022"/>
-        </w:numPr>
-      </w:pPr>
-      <w:r>
-        <w:rPr>
-          <w:b/>
-          <w:bCs/>
-        </w:rPr>
-        <w:t xml:space="preserve">Publishing cadence</w:t>
-      </w:r>
-      <w:r>
-        <w:t xml:space="preserve">: {e.g. </w:t>
-      </w:r>
-      <w:r>
-        <w:t xml:space="preserve">“two posts a month”</w:t>
-      </w:r>
-      <w:r>
-        <w:t xml:space="preserve"> </w:t>
-      </w:r>
-      <w:r>
-        <w:t xml:space="preserve">or</w:t>
-      </w:r>
-      <w:r>
-        <w:t xml:space="preserve"> </w:t>
-      </w:r>
-      <w:r>
-        <w:t xml:space="preserve">“ad-hoc”</w:t>
-      </w:r>
-      <w:r>
-        <w:t xml:space="preserve"> </w:t>
-      </w:r>
-      <w:r>
-        <w:t xml:space="preserve">or</w:t>
-      </w:r>
-      <w:r>
-        <w:t xml:space="preserve"> </w:t>
-      </w:r>
-      <w:r>
-        <w:t xml:space="preserve">“none”</w:t>
-      </w:r>
-      <w:r>
-        <w:t xml:space="preserve">}</w:t>
-      </w:r>
-    </w:p>
-    <w:p>
-      <w:pPr>
-        <w:pStyle w:val="Compact"/>
-        <w:numPr>
-          <w:ilvl w:val="0"/>
-          <w:numId w:val="1022"/>
-        </w:numPr>
-      </w:pPr>
-      <w:r>
-        <w:rPr>
-          <w:b/>
-          <w:bCs/>
-        </w:rPr>
-        <w:t xml:space="preserve">Team producing content</w:t>
-      </w:r>
-      <w:r>
-        <w:t xml:space="preserve">: {solo founder, in-house writer, freelance, agency, a mix}</w:t>
-      </w:r>
-    </w:p>
-    <w:bookmarkEnd w:id="38"/>
-    <w:bookmarkStart w:id="39" w:name="positioning"/>
-    <w:p>
-      <w:pPr>
-        <w:pStyle w:val="Heading2"/>
-      </w:pPr>
-      <w:r>
-        <w:t xml:space="preserve">Positioning</w:t>
-      </w:r>
-    </w:p>
-    <w:p>
-      <w:pPr>
-        <w:pStyle w:val="Compact"/>
-        <w:numPr>
-          <w:ilvl w:val="0"/>
-          <w:numId w:val="1023"/>
-        </w:numPr>
-      </w:pPr>
-      <w:r>
-        <w:rPr>
-          <w:b/>
-          <w:bCs/>
-        </w:rPr>
-        <w:t xml:space="preserve">Why you win (one sentence)</w:t>
-      </w:r>
-      <w:r>
-        <w:t xml:space="preserve">: {What you do that nobody else does, or do better}</w:t>
-      </w:r>
-    </w:p>
-    <w:p>
-      <w:pPr>
-        <w:pStyle w:val="Compact"/>
-        <w:numPr>
-          <w:ilvl w:val="0"/>
-          <w:numId w:val="1023"/>
-        </w:numPr>
-      </w:pPr>
-      <w:r>
-        <w:rPr>
-          <w:b/>
-          <w:bCs/>
-        </w:rPr>
-        <w:t xml:space="preserve">Three to five competitors the buyer also considers</w:t>
-      </w:r>
-      <w:r>
-        <w:t xml:space="preserve">: {These are the inputs for Sections 2 and 3. Without them the gap analysis cannot run.}</w:t>
-      </w:r>
-    </w:p>
-    <w:p>
-      <w:pPr>
-        <w:pStyle w:val="Compact"/>
-        <w:numPr>
-          <w:ilvl w:val="1"/>
-          <w:numId w:val="1024"/>
-        </w:numPr>
-      </w:pPr>
-      <w:r>
-        <w:t xml:space="preserve">{competitor 1 URL}</w:t>
-      </w:r>
-    </w:p>
-    <w:p>
-      <w:pPr>
-        <w:pStyle w:val="Compact"/>
-        <w:numPr>
-          <w:ilvl w:val="1"/>
-          <w:numId w:val="1024"/>
-        </w:numPr>
-      </w:pPr>
-      <w:r>
-        <w:t xml:space="preserve">{competitor 2 URL}</w:t>
-      </w:r>
-    </w:p>
-    <w:p>
-      <w:pPr>
-        <w:pStyle w:val="Compact"/>
-        <w:numPr>
-          <w:ilvl w:val="1"/>
-          <w:numId w:val="1024"/>
-        </w:numPr>
-      </w:pPr>
-      <w:r>
-        <w:t xml:space="preserve">{competitor 3 URL}</w:t>
-      </w:r>
-    </w:p>
-    <w:p>
-      <w:pPr>
-        <w:pStyle w:val="Compact"/>
-        <w:numPr>
-          <w:ilvl w:val="1"/>
-          <w:numId w:val="1024"/>
-        </w:numPr>
-      </w:pPr>
-      <w:r>
-        <w:t xml:space="preserve">{competitor 4 URL (optional)}</w:t>
-      </w:r>
-    </w:p>
-    <w:p>
-      <w:pPr>
-        <w:pStyle w:val="Compact"/>
-        <w:numPr>
-          <w:ilvl w:val="1"/>
-          <w:numId w:val="1024"/>
-        </w:numPr>
-      </w:pPr>
-      <w:r>
-        <w:t xml:space="preserve">{competitor 5 URL (optional)}</w:t>
-      </w:r>
-    </w:p>
-    <w:p>
-      <w:pPr>
-        <w:pStyle w:val="Compact"/>
-        <w:numPr>
-          <w:ilvl w:val="0"/>
-          <w:numId w:val="1023"/>
-        </w:numPr>
-      </w:pPr>
-      <w:r>
-        <w:rPr>
-          <w:b/>
-          <w:bCs/>
-        </w:rPr>
-        <w:t xml:space="preserve">Pricing tier vs category median</w:t>
-      </w:r>
-      <w:r>
-        <w:t xml:space="preserve">: {e.g. </w:t>
-      </w:r>
-      <w:r>
-        <w:t xml:space="preserve">“priced 3x category median”</w:t>
-      </w:r>
-      <w:r>
-        <w:t xml:space="preserve"> </w:t>
-      </w:r>
-      <w:r>
-        <w:t xml:space="preserve">or</w:t>
-      </w:r>
-      <w:r>
-        <w:t xml:space="preserve"> </w:t>
-      </w:r>
-      <w:r>
-        <w:t xml:space="preserve">“premium tier”</w:t>
-      </w:r>
-      <w:r>
-        <w:t xml:space="preserve">}</w:t>
-      </w:r>
-    </w:p>
-    <w:bookmarkEnd w:id="39"/>
-    <w:bookmarkStart w:id="40" w:name="aeo-priorities"/>
-    <w:p>
-      <w:pPr>
-        <w:pStyle w:val="Heading2"/>
-      </w:pPr>
-      <w:r>
-        <w:t xml:space="preserve">AEO priorities</w:t>
-      </w:r>
-    </w:p>
-    <w:p>
-      <w:pPr>
-        <w:pStyle w:val="Compact"/>
-        <w:numPr>
-          <w:ilvl w:val="0"/>
-          <w:numId w:val="1025"/>
-        </w:numPr>
-      </w:pPr>
-      <w:r>
-        <w:rPr>
-          <w:b/>
-          <w:bCs/>
-        </w:rPr>
-        <w:t xml:space="preserve">Which LLM your ICP uses most</w:t>
-      </w:r>
-      <w:r>
-        <w:t xml:space="preserve">: {ChatGPT / Claude / Perplexity / Google AI Overview / all four}</w:t>
-      </w:r>
-    </w:p>
-    <w:p>
-      <w:pPr>
-        <w:pStyle w:val="Compact"/>
-        <w:numPr>
-          <w:ilvl w:val="0"/>
-          <w:numId w:val="1025"/>
-        </w:numPr>
-      </w:pPr>
-      <w:r>
-        <w:rPr>
-          <w:b/>
-          <w:bCs/>
-        </w:rPr>
-        <w:t xml:space="preserve">Current AEO presence suspicion</w:t>
-      </w:r>
-      <w:r>
-        <w:t xml:space="preserve">: {e.g. </w:t>
-      </w:r>
-      <w:r>
-        <w:t xml:space="preserve">“I tested ChatGPT on</w:t>
-      </w:r>
-      <w:r>
-        <w:t xml:space="preserve"> </w:t>
-      </w:r>
-      <w:r>
-        <w:t xml:space="preserve">‘best X for Y’</w:t>
-      </w:r>
-      <w:r>
-        <w:t xml:space="preserve"> </w:t>
-      </w:r>
-      <w:r>
-        <w:t xml:space="preserve">and only one competitor came back”</w:t>
-      </w:r>
-      <w:r>
-        <w:t xml:space="preserve"> </w:t>
-      </w:r>
-      <w:r>
-        <w:t xml:space="preserve">or</w:t>
-      </w:r>
-      <w:r>
-        <w:t xml:space="preserve"> </w:t>
-      </w:r>
-      <w:r>
-        <w:t xml:space="preserve">“unknown, never probed”</w:t>
-      </w:r>
-      <w:r>
-        <w:t xml:space="preserve">}</w:t>
-      </w:r>
-    </w:p>
-    <w:p>
-      <w:pPr>
-        <w:pStyle w:val="Compact"/>
-        <w:numPr>
-          <w:ilvl w:val="0"/>
-          <w:numId w:val="1025"/>
-        </w:numPr>
-      </w:pPr>
-      <w:r>
-        <w:rPr>
-          <w:b/>
-          <w:bCs/>
-        </w:rPr>
-        <w:t xml:space="preserve">Category questions you suspect matter most</w:t>
-      </w:r>
-      <w:r>
-        <w:t xml:space="preserve">: {3 to 5 questions you hear from customers, in their register}</w:t>
-      </w:r>
-    </w:p>
-    <w:bookmarkEnd w:id="40"/>
-    <w:bookmarkStart w:id="41" w:name="tool-stack"/>
-    <w:p>
-      <w:pPr>
-        <w:pStyle w:val="Heading2"/>
-      </w:pPr>
-      <w:r>
-        <w:t xml:space="preserve">Tool stack</w:t>
-      </w:r>
-    </w:p>
-    <w:p>
-      <w:pPr>
-        <w:pStyle w:val="Compact"/>
-        <w:numPr>
-          <w:ilvl w:val="0"/>
-          <w:numId w:val="1026"/>
-        </w:numPr>
-      </w:pPr>
-      <w:r>
-        <w:rPr>
-          <w:b/>
-          <w:bCs/>
-        </w:rPr>
-        <w:t xml:space="preserve">Website / CMS</w:t>
-      </w:r>
-      <w:r>
-        <w:t xml:space="preserve">: {Shopify, WordPress, Next.js, etc.}</w:t>
-      </w:r>
-    </w:p>
-    <w:p>
-      <w:pPr>
-        <w:pStyle w:val="Compact"/>
-        <w:numPr>
-          <w:ilvl w:val="0"/>
-          <w:numId w:val="1026"/>
-        </w:numPr>
-      </w:pPr>
-      <w:r>
-        <w:rPr>
-          <w:b/>
-          <w:bCs/>
-        </w:rPr>
-        <w:t xml:space="preserve">Analytics</w:t>
-      </w:r>
-      <w:r>
-        <w:t xml:space="preserve">: {GA4, Mixpanel, etc.}</w:t>
-      </w:r>
-    </w:p>
-    <w:p>
-      <w:pPr>
-        <w:pStyle w:val="Compact"/>
-        <w:numPr>
-          <w:ilvl w:val="0"/>
-          <w:numId w:val="1026"/>
-        </w:numPr>
-      </w:pPr>
-      <w:r>
-        <w:rPr>
-          <w:b/>
-          <w:bCs/>
-        </w:rPr>
-        <w:t xml:space="preserve">Search visibility</w:t>
-      </w:r>
-      <w:r>
-        <w:t xml:space="preserve">: {Google Search Console property name}</w:t>
-      </w:r>
-    </w:p>
-    <w:p>
-      <w:pPr>
-        <w:pStyle w:val="Compact"/>
-        <w:numPr>
-          <w:ilvl w:val="0"/>
-          <w:numId w:val="1026"/>
-        </w:numPr>
-      </w:pPr>
-      <w:r>
-        <w:rPr>
-          <w:b/>
-          <w:bCs/>
-        </w:rPr>
-        <w:t xml:space="preserve">Content production</w:t>
-      </w:r>
-      <w:r>
-        <w:t xml:space="preserve">: {Google Docs, Notion, CMS-native, etc.}</w:t>
-      </w:r>
-    </w:p>
-    <w:p>
-      <w:pPr>
-        <w:pStyle w:val="Compact"/>
-        <w:numPr>
-          <w:ilvl w:val="0"/>
-          <w:numId w:val="1026"/>
-        </w:numPr>
-      </w:pPr>
-      <w:r>
-        <w:rPr>
-          <w:b/>
-          <w:bCs/>
-        </w:rPr>
-        <w:t xml:space="preserve">SEO tools currently in use</w:t>
-      </w:r>
-      <w:r>
-        <w:t xml:space="preserve">: {Ahrefs, Semrush, SurferSEO, Clearscope, etc.}</w:t>
-      </w:r>
-    </w:p>
-    <w:p>
-      <w:pPr>
-        <w:pStyle w:val="Compact"/>
-        <w:numPr>
-          <w:ilvl w:val="0"/>
-          <w:numId w:val="1026"/>
-        </w:numPr>
-      </w:pPr>
-      <w:r>
-        <w:rPr>
-          <w:b/>
-          <w:bCs/>
-        </w:rPr>
-        <w:t xml:space="preserve">AI assistants already in use</w:t>
-      </w:r>
-      <w:r>
-        <w:t xml:space="preserve">: {Claude, ChatGPT, Perplexity, Gemini}</w:t>
-      </w:r>
-    </w:p>
-    <w:bookmarkEnd w:id="41"/>
-    <w:bookmarkStart w:id="42" w:name="known-constraints"/>
-    <w:p>
-      <w:pPr>
-        <w:pStyle w:val="Heading2"/>
-      </w:pPr>
-      <w:r>
-        <w:t xml:space="preserve">Known constraints</w:t>
-      </w:r>
-    </w:p>
-    <w:p>
-      <w:pPr>
-        <w:pStyle w:val="Compact"/>
-        <w:numPr>
-          <w:ilvl w:val="0"/>
-          <w:numId w:val="1027"/>
-        </w:numPr>
-      </w:pPr>
-      <w:r>
-        <w:rPr>
-          <w:b/>
-          <w:bCs/>
-        </w:rPr>
-        <w:t xml:space="preserve">Capital</w:t>
-      </w:r>
-      <w:r>
-        <w:t xml:space="preserve">: {Funded / bootstrapped / pre-revenue}</w:t>
-      </w:r>
-    </w:p>
-    <w:p>
-      <w:pPr>
-        <w:pStyle w:val="Compact"/>
-        <w:numPr>
-          <w:ilvl w:val="0"/>
-          <w:numId w:val="1027"/>
-        </w:numPr>
-      </w:pPr>
-      <w:r>
-        <w:rPr>
-          <w:b/>
-          <w:bCs/>
-        </w:rPr>
-        <w:t xml:space="preserve">Team size</w:t>
-      </w:r>
-      <w:r>
-        <w:t xml:space="preserve">: {Current head count by function, especially content producers}</w:t>
-      </w:r>
-    </w:p>
-    <w:p>
-      <w:pPr>
-        <w:pStyle w:val="Compact"/>
-        <w:numPr>
-          <w:ilvl w:val="0"/>
-          <w:numId w:val="1027"/>
-        </w:numPr>
-      </w:pPr>
-      <w:r>
-        <w:rPr>
-          <w:b/>
-          <w:bCs/>
-        </w:rPr>
-        <w:t xml:space="preserve">Publishing velocity ceiling</w:t>
-      </w:r>
-      <w:r>
-        <w:t xml:space="preserve">: {Realistic max pieces per month given team and budget}</w:t>
-      </w:r>
-    </w:p>
-    <w:p>
-      <w:pPr>
-        <w:pStyle w:val="Compact"/>
-        <w:numPr>
-          <w:ilvl w:val="0"/>
-          <w:numId w:val="1027"/>
-        </w:numPr>
-      </w:pPr>
-      <w:r>
-        <w:rPr>
-          <w:b/>
-          <w:bCs/>
-        </w:rPr>
-        <w:t xml:space="preserve">Subject-matter expertise access</w:t>
-      </w:r>
-      <w:r>
-        <w:t xml:space="preserve">: {In-house experts, founder availability for interviews, external expert network}</w:t>
-      </w:r>
-    </w:p>
-    <w:bookmarkEnd w:id="42"/>
-    <w:bookmarkStart w:id="43" w:name="growth-goals-for-content"/>
-    <w:p>
-      <w:pPr>
-        <w:pStyle w:val="Heading2"/>
-      </w:pPr>
-      <w:r>
-        <w:t xml:space="preserve">Growth goals for content</w:t>
-      </w:r>
-    </w:p>
-    <w:p>
-      <w:pPr>
-        <w:pStyle w:val="Compact"/>
-        <w:numPr>
-          <w:ilvl w:val="0"/>
-          <w:numId w:val="1028"/>
-        </w:numPr>
-      </w:pPr>
-      <w:r>
-        <w:rPr>
-          <w:b/>
-          <w:bCs/>
-        </w:rPr>
-        <w:t xml:space="preserve">12-month organic traffic goal</w:t>
-      </w:r>
-      <w:r>
-        <w:t xml:space="preserve">: {e.g. </w:t>
-      </w:r>
-      <w:r>
-        <w:t xml:space="preserve">“5x current from 2,000 to 10,000 monthly organic sessions”</w:t>
-      </w:r>
-      <w:r>
-        <w:t xml:space="preserve">}</w:t>
-      </w:r>
-    </w:p>
-    <w:p>
-      <w:pPr>
-        <w:pStyle w:val="Compact"/>
-        <w:numPr>
-          <w:ilvl w:val="0"/>
-          <w:numId w:val="1028"/>
-        </w:numPr>
-      </w:pPr>
-      <w:r>
-        <w:rPr>
-          <w:b/>
-          <w:bCs/>
-        </w:rPr>
-        <w:t xml:space="preserve">Primary outcome the content must drive</w:t>
-      </w:r>
-      <w:r>
-        <w:t xml:space="preserve">: {e.g. </w:t>
-      </w:r>
-      <w:r>
-        <w:t xml:space="preserve">“demo bookings”</w:t>
-      </w:r>
-      <w:r>
-        <w:t xml:space="preserve">,</w:t>
-      </w:r>
-      <w:r>
-        <w:t xml:space="preserve"> </w:t>
-      </w:r>
-      <w:r>
-        <w:t xml:space="preserve">“product-page visits that convert to ATC”</w:t>
-      </w:r>
-      <w:r>
-        <w:t xml:space="preserve">,</w:t>
-      </w:r>
-      <w:r>
-        <w:t xml:space="preserve"> </w:t>
-      </w:r>
-      <w:r>
-        <w:t xml:space="preserve">“email signups that flow to a 12-email sequence”</w:t>
-      </w:r>
-      <w:r>
-        <w:t xml:space="preserve">}</w:t>
-      </w:r>
-    </w:p>
-    <w:p>
-      <w:pPr>
-        <w:pStyle w:val="Compact"/>
-        <w:numPr>
-          <w:ilvl w:val="0"/>
-          <w:numId w:val="1028"/>
-        </w:numPr>
-      </w:pPr>
-      <w:r>
-        <w:rPr>
-          <w:b/>
-          <w:bCs/>
-        </w:rPr>
-        <w:t xml:space="preserve">What</w:t>
-      </w:r>
-      <w:r>
-        <w:rPr>
-          <w:b/>
-          <w:bCs/>
-        </w:rPr>
-        <w:t xml:space="preserve"> </w:t>
-      </w:r>
-      <w:r>
-        <w:rPr>
-          <w:b/>
-          <w:bCs/>
-        </w:rPr>
-        <w:t xml:space="preserve">“winning”</w:t>
-      </w:r>
-      <w:r>
-        <w:rPr>
-          <w:b/>
-          <w:bCs/>
-        </w:rPr>
-        <w:t xml:space="preserve"> </w:t>
-      </w:r>
-      <w:r>
-        <w:rPr>
-          <w:b/>
-          <w:bCs/>
-        </w:rPr>
-        <w:t xml:space="preserve">looks like in 90 days</w:t>
-      </w:r>
-      <w:r>
-        <w:t xml:space="preserve">: {Leading indicators: clusters launched, pillar pages live, AEO citations earned, traffic to new cluster pages}</w:t>
-      </w:r>
-    </w:p>
-    <w:bookmarkEnd w:id="43"/>
-    <w:bookmarkStart w:id="44" w:name="voice-and-brand-guidelines"/>
-    <w:p>
-      <w:pPr>
-        <w:pStyle w:val="Heading2"/>
-      </w:pPr>
-      <w:r>
-        <w:t xml:space="preserve">Voice and brand guidelines</w:t>
-      </w:r>
-    </w:p>
-    <w:p>
-      <w:pPr>
-        <w:pStyle w:val="Compact"/>
-        <w:numPr>
-          <w:ilvl w:val="0"/>
-          <w:numId w:val="1029"/>
-        </w:numPr>
-      </w:pPr>
-      <w:r>
-        <w:rPr>
-          <w:b/>
-          <w:bCs/>
-        </w:rPr>
-        <w:t xml:space="preserve">Spelling conventions</w:t>
-      </w:r>
-      <w:r>
-        <w:t xml:space="preserve">: {e.g. </w:t>
-      </w:r>
-      <w:r>
-        <w:t xml:space="preserve">“ecommerce one word, never e-commerce”</w:t>
-      </w:r>
-      <w:r>
-        <w:t xml:space="preserve">}</w:t>
-      </w:r>
-    </w:p>
-    <w:p>
-      <w:pPr>
-        <w:pStyle w:val="Compact"/>
-        <w:numPr>
-          <w:ilvl w:val="0"/>
-          <w:numId w:val="1029"/>
-        </w:numPr>
-      </w:pPr>
-      <w:r>
-        <w:rPr>
-          <w:b/>
-          <w:bCs/>
-        </w:rPr>
-        <w:t xml:space="preserve">Phrases to avoid</w:t>
-      </w:r>
-      <w:r>
-        <w:t xml:space="preserve">: {Banned clichés, jargon you reject}</w:t>
-      </w:r>
-    </w:p>
-    <w:p>
-      <w:pPr>
-        <w:pStyle w:val="Compact"/>
-        <w:numPr>
-          <w:ilvl w:val="0"/>
-          <w:numId w:val="1029"/>
-        </w:numPr>
-      </w:pPr>
-      <w:r>
-        <w:rPr>
-          <w:b/>
-          <w:bCs/>
-        </w:rPr>
-        <w:t xml:space="preserve">Phrases the brand owns</w:t>
-      </w:r>
-      <w:r>
-        <w:t xml:space="preserve">: {Recurring taglines, headlines, catchphrases}</w:t>
-      </w:r>
-    </w:p>
-    <w:p>
-      <w:pPr>
-        <w:pStyle w:val="Compact"/>
-        <w:numPr>
-          <w:ilvl w:val="0"/>
-          <w:numId w:val="1029"/>
-        </w:numPr>
-      </w:pPr>
-      <w:r>
-        <w:rPr>
-          <w:b/>
-          <w:bCs/>
-        </w:rPr>
-        <w:t xml:space="preserve">Tone</w:t>
-      </w:r>
-      <w:r>
-        <w:t xml:space="preserve">: {Direct / warm / technical / luxury / conversational}</w:t>
-      </w:r>
-    </w:p>
-    <w:bookmarkEnd w:id="44"/>
-    <w:bookmarkStart w:id="45" w:name="X56332a15ed686da6a8eaad1514bf1e540c4b3c8"/>
-    <w:p>
-      <w:pPr>
-        <w:pStyle w:val="Heading2"/>
-      </w:pPr>
-      <w:r>
-        <w:t xml:space="preserve">Session history (updated by Claude across sessions)</w:t>
-      </w:r>
-    </w:p>
-    <w:p>
-      <w:pPr>
-        <w:pStyle w:val="BlockText"/>
-      </w:pPr>
-      <w:r>
-        <w:t xml:space="preserve">Claude will append notes below as it learns patterns specific to your business. Leave blank to start.</w:t>
+        <w:t xml:space="preserve">“to be confirmed”</w:t>
+      </w:r>
+      <w:r>
+        <w:t xml:space="preserve">. Do not invent.</w:t>
       </w:r>
     </w:p>
     <w:p>
@@ -4466,14 +3930,24 @@
         </w:pict>
       </w:r>
     </w:p>
-    <w:bookmarkEnd w:id="45"/>
-    <w:bookmarkStart w:id="46" w:name="how-claude-should-use-this-file"/>
+    <w:bookmarkEnd w:id="36"/>
+    <w:bookmarkEnd w:id="37"/>
+    <w:bookmarkStart w:id="38" w:name="step-2.-inventory-tool-access"/>
     <w:p>
       <w:pPr>
         <w:pStyle w:val="Heading2"/>
       </w:pPr>
       <w:r>
-        <w:t xml:space="preserve">How Claude should use this file</w:t>
+        <w:rPr>
+          <w:rStyle w:val="SectionNumber"/>
+        </w:rPr>
+        <w:t xml:space="preserve">1.14</w:t>
+      </w:r>
+      <w:r>
+        <w:tab/>
+      </w:r>
+      <w:r>
+        <w:t xml:space="preserve">Step 2. Inventory tool access</w:t>
       </w:r>
     </w:p>
     <w:p>
@@ -4481,13 +3955,146 @@
         <w:pStyle w:val="FirstParagraph"/>
       </w:pPr>
       <w:r>
-        <w:t xml:space="preserve">On every session start, load this brief and treat it as ground truth for the brand’s specifics. When running the Content Gap playbook (or any other playbook) in this folder, cross-reference the inputs here before asking the user for them. Do not invent values. If a field is blank, ask the user to fill it in before running any work that depends on it.</w:t>
-      </w:r>
-      <w:r>
-        <w:t xml:space="preserve"> </w:t>
-      </w:r>
-      <w:r>
-        <w:t xml:space="preserve"># Content Gap + AEO Opportunity: Master Prompt</w:t>
+        <w:t xml:space="preserve">Read</w:t>
+      </w:r>
+      <w:r>
+        <w:t xml:space="preserve"> </w:t>
+      </w:r>
+      <w:r>
+        <w:rPr>
+          <w:rStyle w:val="VerbatimChar"/>
+        </w:rPr>
+        <w:t xml:space="preserve">.env</w:t>
+      </w:r>
+      <w:r>
+        <w:t xml:space="preserve"> </w:t>
+      </w:r>
+      <w:r>
+        <w:t xml:space="preserve">in the current working directory. Print the credential inventory:</w:t>
+      </w:r>
+    </w:p>
+    <w:p>
+      <w:pPr>
+        <w:pStyle w:val="SourceCode"/>
+      </w:pPr>
+      <w:r>
+        <w:rPr>
+          <w:rStyle w:val="VerbatimChar"/>
+        </w:rPr>
+        <w:t xml:space="preserve">External tools (public data)</w:t>
+      </w:r>
+      <w:r>
+        <w:br/>
+      </w:r>
+      <w:r>
+        <w:rPr>
+          <w:rStyle w:val="VerbatimChar"/>
+        </w:rPr>
+        <w:t xml:space="preserve">- DataForSEO: configured / not configured</w:t>
+      </w:r>
+      <w:r>
+        <w:br/>
+      </w:r>
+      <w:r>
+        <w:rPr>
+          <w:rStyle w:val="VerbatimChar"/>
+        </w:rPr>
+        <w:t xml:space="preserve">- Serper: configured / not configured</w:t>
+      </w:r>
+      <w:r>
+        <w:br/>
+      </w:r>
+      <w:r>
+        <w:rPr>
+          <w:rStyle w:val="VerbatimChar"/>
+        </w:rPr>
+        <w:t xml:space="preserve">- Keywords Everywhere: configured / not configured</w:t>
+      </w:r>
+      <w:r>
+        <w:br/>
+      </w:r>
+      <w:r>
+        <w:rPr>
+          <w:rStyle w:val="VerbatimChar"/>
+        </w:rPr>
+        <w:t xml:space="preserve">- Ahrefs: configured / not configured</w:t>
+      </w:r>
+      <w:r>
+        <w:br/>
+      </w:r>
+      <w:r>
+        <w:rPr>
+          <w:rStyle w:val="VerbatimChar"/>
+        </w:rPr>
+        <w:t xml:space="preserve">- Google PageSpeed Insights (GOOGLE_AI_KEY): configured / not configured</w:t>
+      </w:r>
+      <w:r>
+        <w:br/>
+      </w:r>
+      <w:r>
+        <w:br/>
+      </w:r>
+      <w:r>
+        <w:rPr>
+          <w:rStyle w:val="VerbatimChar"/>
+        </w:rPr>
+        <w:t xml:space="preserve">Internal tools (your brand's own data)</w:t>
+      </w:r>
+      <w:r>
+        <w:br/>
+      </w:r>
+      <w:r>
+        <w:rPr>
+          <w:rStyle w:val="VerbatimChar"/>
+        </w:rPr>
+        <w:t xml:space="preserve">- Google Search Console: configured / not configured</w:t>
+      </w:r>
+      <w:r>
+        <w:br/>
+      </w:r>
+      <w:r>
+        <w:rPr>
+          <w:rStyle w:val="VerbatimChar"/>
+        </w:rPr>
+        <w:t xml:space="preserve">- Google Analytics 4: configured / not configured</w:t>
+      </w:r>
+      <w:r>
+        <w:br/>
+      </w:r>
+      <w:r>
+        <w:br/>
+      </w:r>
+      <w:r>
+        <w:rPr>
+          <w:rStyle w:val="VerbatimChar"/>
+        </w:rPr>
+        <w:t xml:space="preserve">LLM access (for AEO probes)</w:t>
+      </w:r>
+      <w:r>
+        <w:br/>
+      </w:r>
+      <w:r>
+        <w:rPr>
+          <w:rStyle w:val="VerbatimChar"/>
+        </w:rPr>
+        <w:t xml:space="preserve">- ChatGPT Plus / Claude Pro / Perplexity Pro: user-confirmed</w:t>
+      </w:r>
+    </w:p>
+    <w:p>
+      <w:pPr>
+        <w:pStyle w:val="FirstParagraph"/>
+      </w:pPr>
+      <w:r>
+        <w:t xml:space="preserve">For each external tool flagged</w:t>
+      </w:r>
+      <w:r>
+        <w:t xml:space="preserve"> </w:t>
+      </w:r>
+      <w:r>
+        <w:t xml:space="preserve">“not configured”</w:t>
+      </w:r>
+      <w:r>
+        <w:t xml:space="preserve">, ask:</w:t>
       </w:r>
     </w:p>
     <w:p>
@@ -4495,7 +4102,75 @@
         <w:pStyle w:val="BlockText"/>
       </w:pPr>
       <w:r>
-        <w:t xml:space="preserve">Paste this entire file into Claude Code from a folder containing a</w:t>
+        <w:t xml:space="preserve">“</w:t>
+      </w:r>
+      <w:r>
+        <w:rPr>
+          <w:rStyle w:val="VerbatimChar"/>
+        </w:rPr>
+        <w:t xml:space="preserve">{Tool}</w:t>
+      </w:r>
+      <w:r>
+        <w:t xml:space="preserve"> </w:t>
+      </w:r>
+      <w:r>
+        <w:t xml:space="preserve">is not configured. Want me to look up the current sign-up steps and API-key retrieval flow, so we can populate more of the analysis? Answer</w:t>
+      </w:r>
+      <w:r>
+        <w:t xml:space="preserve"> </w:t>
+      </w:r>
+      <w:r>
+        <w:rPr>
+          <w:rStyle w:val="VerbatimChar"/>
+        </w:rPr>
+        <w:t xml:space="preserve">yes</w:t>
+      </w:r>
+      <w:r>
+        <w:t xml:space="preserve">,</w:t>
+      </w:r>
+      <w:r>
+        <w:t xml:space="preserve"> </w:t>
+      </w:r>
+      <w:r>
+        <w:rPr>
+          <w:rStyle w:val="VerbatimChar"/>
+        </w:rPr>
+        <w:t xml:space="preserve">no</w:t>
+      </w:r>
+      <w:r>
+        <w:t xml:space="preserve">, or</w:t>
+      </w:r>
+      <w:r>
+        <w:t xml:space="preserve"> </w:t>
+      </w:r>
+      <w:r>
+        <w:rPr>
+          <w:rStyle w:val="VerbatimChar"/>
+        </w:rPr>
+        <w:t xml:space="preserve">skip all</w:t>
+      </w:r>
+      <w:r>
+        <w:t xml:space="preserve">.”</w:t>
+      </w:r>
+    </w:p>
+    <w:p>
+      <w:pPr>
+        <w:pStyle w:val="FirstParagraph"/>
+      </w:pPr>
+      <w:r>
+        <w:t xml:space="preserve">If</w:t>
+      </w:r>
+      <w:r>
+        <w:t xml:space="preserve"> </w:t>
+      </w:r>
+      <w:r>
+        <w:rPr>
+          <w:rStyle w:val="VerbatimChar"/>
+        </w:rPr>
+        <w:t xml:space="preserve">yes</w:t>
+      </w:r>
+      <w:r>
+        <w:t xml:space="preserve">: use WebSearch and WebFetch to pull the current sign-up flow for that specific tool (pricing, free-tier availability, API-key retrieval location, exact</w:t>
       </w:r>
       <w:r>
         <w:t xml:space="preserve"> </w:t>
@@ -4510,45 +4185,55 @@
         <w:t xml:space="preserve"> </w:t>
       </w:r>
       <w:r>
-        <w:t xml:space="preserve">(your API keys). If a</w:t>
-      </w:r>
-      <w:r>
-        <w:t xml:space="preserve"> </w:t>
-      </w:r>
-      <w:r>
-        <w:rPr>
-          <w:rStyle w:val="VerbatimChar"/>
-        </w:rPr>
-        <w:t xml:space="preserve">CLAUDE.md</w:t>
-      </w:r>
-      <w:r>
-        <w:t xml:space="preserve"> </w:t>
-      </w:r>
-      <w:r>
-        <w:t xml:space="preserve">business brief is already populated, Claude loads it and proceeds. Otherwise Claude interviews you conversationally for the business specifics and writes the</w:t>
-      </w:r>
-      <w:r>
-        <w:t xml:space="preserve"> </w:t>
-      </w:r>
-      <w:r>
-        <w:rPr>
-          <w:rStyle w:val="VerbatimChar"/>
-        </w:rPr>
-        <w:t xml:space="preserve">CLAUDE.md</w:t>
-      </w:r>
-      <w:r>
-        <w:t xml:space="preserve"> </w:t>
-      </w:r>
-      <w:r>
-        <w:t xml:space="preserve">for you. Either way, Claude runs the analysis end-to-end, produces a single consolidated report in markdown and Word formats, and saves supporting data alongside.</w:t>
-      </w:r>
-    </w:p>
-    <w:p>
-      <w:pPr>
-        <w:pStyle w:val="BlockText"/>
-      </w:pPr>
-      <w:r>
-        <w:t xml:space="preserve">Built by Nishant Kapoor at EntireCommerce AI. Version 1, April 2026.</w:t>
+        <w:t xml:space="preserve">variable name). Produce step-by-step instructions the user can follow in 5 minutes.</w:t>
+      </w:r>
+    </w:p>
+    <w:p>
+      <w:pPr>
+        <w:pStyle w:val="BodyText"/>
+      </w:pPr>
+      <w:r>
+        <w:t xml:space="preserve">If</w:t>
+      </w:r>
+      <w:r>
+        <w:t xml:space="preserve"> </w:t>
+      </w:r>
+      <w:r>
+        <w:rPr>
+          <w:rStyle w:val="VerbatimChar"/>
+        </w:rPr>
+        <w:t xml:space="preserve">no</w:t>
+      </w:r>
+      <w:r>
+        <w:t xml:space="preserve">: skip that tool, move to the next.</w:t>
+      </w:r>
+    </w:p>
+    <w:p>
+      <w:pPr>
+        <w:pStyle w:val="BodyText"/>
+      </w:pPr>
+      <w:r>
+        <w:t xml:space="preserve">If</w:t>
+      </w:r>
+      <w:r>
+        <w:t xml:space="preserve"> </w:t>
+      </w:r>
+      <w:r>
+        <w:rPr>
+          <w:rStyle w:val="VerbatimChar"/>
+        </w:rPr>
+        <w:t xml:space="preserve">skip all</w:t>
+      </w:r>
+      <w:r>
+        <w:t xml:space="preserve">: proceed to Step 3 with the current credentials.</w:t>
+      </w:r>
+    </w:p>
+    <w:p>
+      <w:pPr>
+        <w:pStyle w:val="BodyText"/>
+      </w:pPr>
+      <w:r>
+        <w:t xml:space="preserve">Never hardcode sign-up URLs or pricing from memory. Pull fresh from the web every time.</w:t>
       </w:r>
     </w:p>
     <w:p>
@@ -4558,751 +4243,21 @@
         </w:pict>
       </w:r>
     </w:p>
-    <w:p>
-      <w:pPr>
-        <w:pStyle w:val="FirstParagraph"/>
-      </w:pPr>
-      <w:r>
-        <w:t xml:space="preserve">You are executing the Content Gap + AEO Opportunity playbook for the brand in the current working directory. Follow these steps in order. Do not skip steps. Do not invent data. Honour the voice conventions in Step 6.</w:t>
-      </w:r>
-    </w:p>
-    <w:p>
-      <w:r>
-        <w:pict>
-          <v:rect style="width:0;height:1.5pt" o:hralign="center" o:hrstd="t" o:hr="t"/>
-        </w:pict>
-      </w:r>
-    </w:p>
-    <w:bookmarkEnd w:id="46"/>
-    <w:bookmarkStart w:id="49" w:name="X984eac9891fea7dcd5834405f0d4b876161ed1c"/>
+    <w:bookmarkEnd w:id="38"/>
+    <w:bookmarkStart w:id="39" w:name="step-3.-detect-the-mode"/>
     <w:p>
       <w:pPr>
         <w:pStyle w:val="Heading2"/>
       </w:pPr>
       <w:r>
-        <w:t xml:space="preserve">Step 1. Load or populate the business brief</w:t>
-      </w:r>
-    </w:p>
-    <w:p>
-      <w:pPr>
-        <w:pStyle w:val="FirstParagraph"/>
-      </w:pPr>
-      <w:r>
-        <w:t xml:space="preserve">Look for</w:t>
-      </w:r>
-      <w:r>
-        <w:t xml:space="preserve"> </w:t>
-      </w:r>
-      <w:r>
-        <w:rPr>
-          <w:rStyle w:val="VerbatimChar"/>
-        </w:rPr>
-        <w:t xml:space="preserve">CLAUDE.md</w:t>
-      </w:r>
-      <w:r>
-        <w:t xml:space="preserve"> </w:t>
-      </w:r>
-      <w:r>
-        <w:t xml:space="preserve">in the current working directory.</w:t>
-      </w:r>
-    </w:p>
-    <w:p>
-      <w:pPr>
-        <w:pStyle w:val="BodyText"/>
-      </w:pPr>
-      <w:r>
-        <w:rPr>
-          <w:b/>
-          <w:bCs/>
-        </w:rPr>
-        <w:t xml:space="preserve">If</w:t>
-      </w:r>
-      <w:r>
-        <w:rPr>
-          <w:b/>
-          <w:bCs/>
-        </w:rPr>
-        <w:t xml:space="preserve"> </w:t>
-      </w:r>
-      <w:r>
-        <w:rPr>
-          <w:rStyle w:val="VerbatimChar"/>
-          <w:b/>
-          <w:bCs/>
-        </w:rPr>
-        <w:t xml:space="preserve">CLAUDE.md</w:t>
-      </w:r>
-      <w:r>
-        <w:rPr>
-          <w:b/>
-          <w:bCs/>
-        </w:rPr>
-        <w:t xml:space="preserve"> </w:t>
-      </w:r>
-      <w:r>
-        <w:rPr>
-          <w:b/>
-          <w:bCs/>
-        </w:rPr>
-        <w:t xml:space="preserve">exists and is fully filled in</w:t>
-      </w:r>
-      <w:r>
-        <w:t xml:space="preserve"> </w:t>
-      </w:r>
-      <w:r>
-        <w:t xml:space="preserve">(no</w:t>
-      </w:r>
-      <w:r>
-        <w:t xml:space="preserve"> </w:t>
-      </w:r>
-      <w:r>
-        <w:rPr>
-          <w:rStyle w:val="VerbatimChar"/>
-        </w:rPr>
-        <w:t xml:space="preserve">{placeholder}</w:t>
-      </w:r>
-      <w:r>
-        <w:t xml:space="preserve"> </w:t>
-      </w:r>
-      <w:r>
-        <w:t xml:space="preserve">text remaining, required fields populated), read it and proceed to Step 2.</w:t>
-      </w:r>
-    </w:p>
-    <w:p>
-      <w:pPr>
-        <w:pStyle w:val="BodyText"/>
-      </w:pPr>
-      <w:r>
-        <w:rPr>
-          <w:b/>
-          <w:bCs/>
-        </w:rPr>
-        <w:t xml:space="preserve">If</w:t>
-      </w:r>
-      <w:r>
-        <w:rPr>
-          <w:b/>
-          <w:bCs/>
-        </w:rPr>
-        <w:t xml:space="preserve"> </w:t>
-      </w:r>
-      <w:r>
-        <w:rPr>
-          <w:rStyle w:val="VerbatimChar"/>
-          <w:b/>
-          <w:bCs/>
-        </w:rPr>
-        <w:t xml:space="preserve">CLAUDE.md</w:t>
-      </w:r>
-      <w:r>
-        <w:rPr>
-          <w:b/>
-          <w:bCs/>
-        </w:rPr>
-        <w:t xml:space="preserve"> </w:t>
-      </w:r>
-      <w:r>
-        <w:rPr>
-          <w:b/>
-          <w:bCs/>
-        </w:rPr>
-        <w:t xml:space="preserve">does not exist, contains placeholder text, or is missing required fields, run the business-brief interview before proceeding.</w:t>
-      </w:r>
-      <w:r>
-        <w:t xml:space="preserve"> </w:t>
-      </w:r>
-      <w:r>
-        <w:t xml:space="preserve">Do not skip. Do not guess.</w:t>
-      </w:r>
-    </w:p>
-    <w:bookmarkStart w:id="47" w:name="the-business-brief-interview"/>
-    <w:p>
-      <w:pPr>
-        <w:pStyle w:val="Heading3"/>
-      </w:pPr>
-      <w:r>
-        <w:t xml:space="preserve">The business-brief interview</w:t>
-      </w:r>
-    </w:p>
-    <w:p>
-      <w:pPr>
-        <w:pStyle w:val="FirstParagraph"/>
-      </w:pPr>
-      <w:r>
-        <w:t xml:space="preserve">Ask the user these questions conversationally, one batch at a time. Write the answers into</w:t>
-      </w:r>
-      <w:r>
-        <w:t xml:space="preserve"> </w:t>
-      </w:r>
-      <w:r>
-        <w:rPr>
-          <w:rStyle w:val="VerbatimChar"/>
-        </w:rPr>
-        <w:t xml:space="preserve">CLAUDE.md</w:t>
-      </w:r>
-      <w:r>
-        <w:t xml:space="preserve"> </w:t>
-      </w:r>
-      <w:r>
-        <w:t xml:space="preserve">progressively (create the file if missing) and confirm before moving on.</w:t>
-      </w:r>
-    </w:p>
-    <w:p>
-      <w:pPr>
-        <w:pStyle w:val="BodyText"/>
-      </w:pPr>
-      <w:r>
-        <w:rPr>
-          <w:b/>
-          <w:bCs/>
-        </w:rPr>
-        <w:t xml:space="preserve">Batch 1: Brand overview.</w:t>
-      </w:r>
-      <w:r>
-        <w:t xml:space="preserve"> </w:t>
-      </w:r>
-      <w:r>
-        <w:t xml:space="preserve">Brand name. Primary URL. Domain age. Ecommerce platform. Geographic focus. Stage.</w:t>
-      </w:r>
-    </w:p>
-    <w:p>
-      <w:pPr>
-        <w:pStyle w:val="BodyText"/>
-      </w:pPr>
-      <w:r>
-        <w:rPr>
-          <w:b/>
-          <w:bCs/>
-        </w:rPr>
-        <w:t xml:space="preserve">Batch 2: Product and audience.</w:t>
-      </w:r>
-      <w:r>
-        <w:t xml:space="preserve"> </w:t>
-      </w:r>
-      <w:r>
-        <w:t xml:space="preserve">What you sell in one sentence. Price range or AOV. Catalog size. Core buyer in one sentence. Where they hang out online.</w:t>
-      </w:r>
-    </w:p>
-    <w:p>
-      <w:pPr>
-        <w:pStyle w:val="BodyText"/>
-      </w:pPr>
-      <w:r>
-        <w:rPr>
-          <w:b/>
-          <w:bCs/>
-        </w:rPr>
-        <w:t xml:space="preserve">Batch 3: Current content footprint.</w:t>
-      </w:r>
-      <w:r>
-        <w:t xml:space="preserve"> </w:t>
-      </w:r>
-      <w:r>
-        <w:t xml:space="preserve">Blog or long-form presence. Monthly organic traffic band. Active topic clusters (if any). Publishing cadence. Team producing content.</w:t>
-      </w:r>
-    </w:p>
-    <w:p>
-      <w:pPr>
-        <w:pStyle w:val="BodyText"/>
-      </w:pPr>
-      <w:r>
-        <w:rPr>
-          <w:b/>
-          <w:bCs/>
-        </w:rPr>
-        <w:t xml:space="preserve">Batch 4: Positioning.</w:t>
-      </w:r>
-      <w:r>
-        <w:t xml:space="preserve"> </w:t>
-      </w:r>
-      <w:r>
-        <w:t xml:space="preserve">Why you win. Three to five competitor URLs. Pricing tier vs category median.</w:t>
-      </w:r>
-    </w:p>
-    <w:p>
-      <w:pPr>
-        <w:pStyle w:val="BodyText"/>
-      </w:pPr>
-      <w:r>
-        <w:rPr>
-          <w:b/>
-          <w:bCs/>
-        </w:rPr>
-        <w:t xml:space="preserve">Batch 5: AEO priorities.</w:t>
-      </w:r>
-      <w:r>
-        <w:t xml:space="preserve"> </w:t>
-      </w:r>
-      <w:r>
-        <w:t xml:space="preserve">Which LLM the ICP uses most. Current AEO presence suspicion. Three to five category questions you hear from customers.</w:t>
-      </w:r>
-    </w:p>
-    <w:p>
-      <w:pPr>
-        <w:pStyle w:val="BodyText"/>
-      </w:pPr>
-      <w:r>
-        <w:rPr>
-          <w:b/>
-          <w:bCs/>
-        </w:rPr>
-        <w:t xml:space="preserve">Batch 6: Tool stack and constraints.</w:t>
-      </w:r>
-      <w:r>
-        <w:t xml:space="preserve"> </w:t>
-      </w:r>
-      <w:r>
-        <w:t xml:space="preserve">Website / CMS. GSC property. SEO tools. Publishing velocity ceiling. Subject-matter expertise access. 12-month organic traffic goal. Primary outcome the content must drive.</w:t>
-      </w:r>
-    </w:p>
-    <w:bookmarkEnd w:id="47"/>
-    <w:bookmarkStart w:id="48" w:name="minimum-required-to-proceed-to-step-2"/>
-    <w:p>
-      <w:pPr>
-        <w:pStyle w:val="Heading3"/>
-      </w:pPr>
-      <w:r>
-        <w:t xml:space="preserve">Minimum required to proceed to Step 2</w:t>
-      </w:r>
-    </w:p>
-    <w:p>
-      <w:pPr>
-        <w:pStyle w:val="FirstParagraph"/>
-      </w:pPr>
-      <w:r>
-        <w:t xml:space="preserve">If after the interview you do not have these seven fields, ask again:</w:t>
-      </w:r>
-    </w:p>
-    <w:p>
-      <w:pPr>
-        <w:pStyle w:val="Compact"/>
-        <w:numPr>
-          <w:ilvl w:val="0"/>
-          <w:numId w:val="1030"/>
-        </w:numPr>
-      </w:pPr>
-      <w:r>
-        <w:t xml:space="preserve">Brand name</w:t>
-      </w:r>
-    </w:p>
-    <w:p>
-      <w:pPr>
-        <w:pStyle w:val="Compact"/>
-        <w:numPr>
-          <w:ilvl w:val="0"/>
-          <w:numId w:val="1030"/>
-        </w:numPr>
-      </w:pPr>
-      <w:r>
-        <w:t xml:space="preserve">Primary URL</w:t>
-      </w:r>
-    </w:p>
-    <w:p>
-      <w:pPr>
-        <w:pStyle w:val="Compact"/>
-        <w:numPr>
-          <w:ilvl w:val="0"/>
-          <w:numId w:val="1030"/>
-        </w:numPr>
-      </w:pPr>
-      <w:r>
-        <w:t xml:space="preserve">What the brand sells (one sentence)</w:t>
-      </w:r>
-    </w:p>
-    <w:p>
-      <w:pPr>
-        <w:pStyle w:val="Compact"/>
-        <w:numPr>
-          <w:ilvl w:val="0"/>
-          <w:numId w:val="1030"/>
-        </w:numPr>
-      </w:pPr>
-      <w:r>
-        <w:t xml:space="preserve">Core buyer (one sentence)</w:t>
-      </w:r>
-    </w:p>
-    <w:p>
-      <w:pPr>
-        <w:pStyle w:val="Compact"/>
-        <w:numPr>
-          <w:ilvl w:val="0"/>
-          <w:numId w:val="1030"/>
-        </w:numPr>
-      </w:pPr>
-      <w:r>
-        <w:t xml:space="preserve">Three to five competitor URLs</w:t>
-      </w:r>
-    </w:p>
-    <w:p>
-      <w:pPr>
-        <w:pStyle w:val="Compact"/>
-        <w:numPr>
-          <w:ilvl w:val="0"/>
-          <w:numId w:val="1030"/>
-        </w:numPr>
-      </w:pPr>
-      <w:r>
-        <w:t xml:space="preserve">Monthly organic traffic band</w:t>
-      </w:r>
-    </w:p>
-    <w:p>
-      <w:pPr>
-        <w:pStyle w:val="Compact"/>
-        <w:numPr>
-          <w:ilvl w:val="0"/>
-          <w:numId w:val="1030"/>
-        </w:numPr>
-      </w:pPr>
-      <w:r>
-        <w:t xml:space="preserve">Which LLM the ICP uses most</w:t>
-      </w:r>
-    </w:p>
-    <w:p>
-      <w:pPr>
-        <w:pStyle w:val="FirstParagraph"/>
-      </w:pPr>
-      <w:r>
-        <w:t xml:space="preserve">Optional fields can be marked</w:t>
-      </w:r>
-      <w:r>
-        <w:t xml:space="preserve"> </w:t>
-      </w:r>
-      <w:r>
-        <w:t xml:space="preserve">“unknown”</w:t>
-      </w:r>
-      <w:r>
-        <w:t xml:space="preserve"> </w:t>
-      </w:r>
-      <w:r>
-        <w:t xml:space="preserve">or</w:t>
-      </w:r>
-      <w:r>
-        <w:t xml:space="preserve"> </w:t>
-      </w:r>
-      <w:r>
-        <w:t xml:space="preserve">“to be confirmed”</w:t>
-      </w:r>
-      <w:r>
-        <w:t xml:space="preserve">. Do not invent.</w:t>
-      </w:r>
-    </w:p>
-    <w:p>
-      <w:r>
-        <w:pict>
-          <v:rect style="width:0;height:1.5pt" o:hralign="center" o:hrstd="t" o:hr="t"/>
-        </w:pict>
-      </w:r>
-    </w:p>
-    <w:bookmarkEnd w:id="48"/>
-    <w:bookmarkEnd w:id="49"/>
-    <w:bookmarkStart w:id="50" w:name="step-2.-inventory-tool-access"/>
-    <w:p>
-      <w:pPr>
-        <w:pStyle w:val="Heading2"/>
-      </w:pPr>
-      <w:r>
-        <w:t xml:space="preserve">Step 2. Inventory tool access</w:t>
-      </w:r>
-    </w:p>
-    <w:p>
-      <w:pPr>
-        <w:pStyle w:val="FirstParagraph"/>
-      </w:pPr>
-      <w:r>
-        <w:t xml:space="preserve">Read</w:t>
-      </w:r>
-      <w:r>
-        <w:t xml:space="preserve"> </w:t>
-      </w:r>
-      <w:r>
-        <w:rPr>
-          <w:rStyle w:val="VerbatimChar"/>
-        </w:rPr>
-        <w:t xml:space="preserve">.env</w:t>
-      </w:r>
-      <w:r>
-        <w:t xml:space="preserve"> </w:t>
-      </w:r>
-      <w:r>
-        <w:t xml:space="preserve">in the current working directory. Print the credential inventory:</w:t>
-      </w:r>
-    </w:p>
-    <w:p>
-      <w:pPr>
-        <w:pStyle w:val="SourceCode"/>
-      </w:pPr>
-      <w:r>
-        <w:rPr>
-          <w:rStyle w:val="VerbatimChar"/>
-        </w:rPr>
-        <w:t xml:space="preserve">External tools (public data)</w:t>
-      </w:r>
-      <w:r>
-        <w:br/>
-      </w:r>
-      <w:r>
-        <w:rPr>
-          <w:rStyle w:val="VerbatimChar"/>
-        </w:rPr>
-        <w:t xml:space="preserve">- DataForSEO: configured / not configured</w:t>
-      </w:r>
-      <w:r>
-        <w:br/>
-      </w:r>
-      <w:r>
-        <w:rPr>
-          <w:rStyle w:val="VerbatimChar"/>
-        </w:rPr>
-        <w:t xml:space="preserve">- Serper: configured / not configured</w:t>
-      </w:r>
-      <w:r>
-        <w:br/>
-      </w:r>
-      <w:r>
-        <w:rPr>
-          <w:rStyle w:val="VerbatimChar"/>
-        </w:rPr>
-        <w:t xml:space="preserve">- Keywords Everywhere: configured / not configured</w:t>
-      </w:r>
-      <w:r>
-        <w:br/>
-      </w:r>
-      <w:r>
-        <w:rPr>
-          <w:rStyle w:val="VerbatimChar"/>
-        </w:rPr>
-        <w:t xml:space="preserve">- Ahrefs: configured / not configured</w:t>
-      </w:r>
-      <w:r>
-        <w:br/>
-      </w:r>
-      <w:r>
-        <w:rPr>
-          <w:rStyle w:val="VerbatimChar"/>
-        </w:rPr>
-        <w:t xml:space="preserve">- Google PageSpeed Insights (GOOGLE_AI_KEY): configured / not configured</w:t>
-      </w:r>
-      <w:r>
-        <w:br/>
-      </w:r>
-      <w:r>
-        <w:br/>
-      </w:r>
-      <w:r>
-        <w:rPr>
-          <w:rStyle w:val="VerbatimChar"/>
-        </w:rPr>
-        <w:t xml:space="preserve">Internal tools (your brand's own data)</w:t>
-      </w:r>
-      <w:r>
-        <w:br/>
-      </w:r>
-      <w:r>
-        <w:rPr>
-          <w:rStyle w:val="VerbatimChar"/>
-        </w:rPr>
-        <w:t xml:space="preserve">- Google Search Console: configured / not configured</w:t>
-      </w:r>
-      <w:r>
-        <w:br/>
-      </w:r>
-      <w:r>
-        <w:rPr>
-          <w:rStyle w:val="VerbatimChar"/>
-        </w:rPr>
-        <w:t xml:space="preserve">- Google Analytics 4: configured / not configured</w:t>
-      </w:r>
-      <w:r>
-        <w:br/>
-      </w:r>
-      <w:r>
-        <w:br/>
-      </w:r>
-      <w:r>
-        <w:rPr>
-          <w:rStyle w:val="VerbatimChar"/>
-        </w:rPr>
-        <w:t xml:space="preserve">LLM access (for AEO probes)</w:t>
-      </w:r>
-      <w:r>
-        <w:br/>
-      </w:r>
-      <w:r>
-        <w:rPr>
-          <w:rStyle w:val="VerbatimChar"/>
-        </w:rPr>
-        <w:t xml:space="preserve">- ChatGPT Plus / Claude Pro / Perplexity Pro: user-confirmed</w:t>
-      </w:r>
-    </w:p>
-    <w:p>
-      <w:pPr>
-        <w:pStyle w:val="FirstParagraph"/>
-      </w:pPr>
-      <w:r>
-        <w:t xml:space="preserve">For each external tool flagged</w:t>
-      </w:r>
-      <w:r>
-        <w:t xml:space="preserve"> </w:t>
-      </w:r>
-      <w:r>
-        <w:t xml:space="preserve">“not configured”</w:t>
-      </w:r>
-      <w:r>
-        <w:t xml:space="preserve">, ask:</w:t>
-      </w:r>
-    </w:p>
-    <w:p>
-      <w:pPr>
-        <w:pStyle w:val="BlockText"/>
-      </w:pPr>
-      <w:r>
-        <w:t xml:space="preserve">“</w:t>
-      </w:r>
-      <w:r>
-        <w:rPr>
-          <w:rStyle w:val="VerbatimChar"/>
-        </w:rPr>
-        <w:t xml:space="preserve">{Tool}</w:t>
-      </w:r>
-      <w:r>
-        <w:t xml:space="preserve"> </w:t>
-      </w:r>
-      <w:r>
-        <w:t xml:space="preserve">is not configured. Want me to look up the current sign-up steps and API-key retrieval flow, so we can populate more of the analysis? Answer</w:t>
-      </w:r>
-      <w:r>
-        <w:t xml:space="preserve"> </w:t>
-      </w:r>
-      <w:r>
-        <w:rPr>
-          <w:rStyle w:val="VerbatimChar"/>
-        </w:rPr>
-        <w:t xml:space="preserve">yes</w:t>
-      </w:r>
-      <w:r>
-        <w:t xml:space="preserve">,</w:t>
-      </w:r>
-      <w:r>
-        <w:t xml:space="preserve"> </w:t>
-      </w:r>
-      <w:r>
-        <w:rPr>
-          <w:rStyle w:val="VerbatimChar"/>
-        </w:rPr>
-        <w:t xml:space="preserve">no</w:t>
-      </w:r>
-      <w:r>
-        <w:t xml:space="preserve">, or</w:t>
-      </w:r>
-      <w:r>
-        <w:t xml:space="preserve"> </w:t>
-      </w:r>
-      <w:r>
-        <w:rPr>
-          <w:rStyle w:val="VerbatimChar"/>
-        </w:rPr>
-        <w:t xml:space="preserve">skip all</w:t>
-      </w:r>
-      <w:r>
-        <w:t xml:space="preserve">.”</w:t>
-      </w:r>
-    </w:p>
-    <w:p>
-      <w:pPr>
-        <w:pStyle w:val="FirstParagraph"/>
-      </w:pPr>
-      <w:r>
-        <w:t xml:space="preserve">If</w:t>
-      </w:r>
-      <w:r>
-        <w:t xml:space="preserve"> </w:t>
-      </w:r>
-      <w:r>
-        <w:rPr>
-          <w:rStyle w:val="VerbatimChar"/>
-        </w:rPr>
-        <w:t xml:space="preserve">yes</w:t>
-      </w:r>
-      <w:r>
-        <w:t xml:space="preserve">: use WebSearch and WebFetch to pull the current sign-up flow for that specific tool (pricing, free-tier availability, API-key retrieval location, exact</w:t>
-      </w:r>
-      <w:r>
-        <w:t xml:space="preserve"> </w:t>
-      </w:r>
-      <w:r>
-        <w:rPr>
-          <w:rStyle w:val="VerbatimChar"/>
-        </w:rPr>
-        <w:t xml:space="preserve">.env</w:t>
-      </w:r>
-      <w:r>
-        <w:t xml:space="preserve"> </w:t>
-      </w:r>
-      <w:r>
-        <w:t xml:space="preserve">variable name). Produce step-by-step instructions the user can follow in 5 minutes.</w:t>
-      </w:r>
-    </w:p>
-    <w:p>
-      <w:pPr>
-        <w:pStyle w:val="BodyText"/>
-      </w:pPr>
-      <w:r>
-        <w:t xml:space="preserve">If</w:t>
-      </w:r>
-      <w:r>
-        <w:t xml:space="preserve"> </w:t>
-      </w:r>
-      <w:r>
-        <w:rPr>
-          <w:rStyle w:val="VerbatimChar"/>
-        </w:rPr>
-        <w:t xml:space="preserve">no</w:t>
-      </w:r>
-      <w:r>
-        <w:t xml:space="preserve">: skip that tool, move to the next.</w:t>
-      </w:r>
-    </w:p>
-    <w:p>
-      <w:pPr>
-        <w:pStyle w:val="BodyText"/>
-      </w:pPr>
-      <w:r>
-        <w:t xml:space="preserve">If</w:t>
-      </w:r>
-      <w:r>
-        <w:t xml:space="preserve"> </w:t>
-      </w:r>
-      <w:r>
-        <w:rPr>
-          <w:rStyle w:val="VerbatimChar"/>
-        </w:rPr>
-        <w:t xml:space="preserve">skip all</w:t>
-      </w:r>
-      <w:r>
-        <w:t xml:space="preserve">: proceed to Step 3 with the current credentials.</w:t>
-      </w:r>
-    </w:p>
-    <w:p>
-      <w:pPr>
-        <w:pStyle w:val="BodyText"/>
-      </w:pPr>
-      <w:r>
-        <w:t xml:space="preserve">Never hardcode sign-up URLs or pricing from memory. Pull fresh from the web every time.</w:t>
-      </w:r>
-    </w:p>
-    <w:p>
-      <w:r>
-        <w:pict>
-          <v:rect style="width:0;height:1.5pt" o:hralign="center" o:hrstd="t" o:hr="t"/>
-        </w:pict>
-      </w:r>
-    </w:p>
-    <w:bookmarkEnd w:id="50"/>
-    <w:bookmarkStart w:id="51" w:name="step-3.-detect-the-mode"/>
-    <w:p>
-      <w:pPr>
-        <w:pStyle w:val="Heading2"/>
-      </w:pPr>
+        <w:rPr>
+          <w:rStyle w:val="SectionNumber"/>
+        </w:rPr>
+        <w:t xml:space="preserve">1.15</w:t>
+      </w:r>
+      <w:r>
+        <w:tab/>
+      </w:r>
       <w:r>
         <w:t xml:space="preserve">Step 3. Detect the mode</w:t>
       </w:r>
@@ -5519,13 +4474,22 @@
         </w:pict>
       </w:r>
     </w:p>
-    <w:bookmarkEnd w:id="51"/>
-    <w:bookmarkStart w:id="60" w:name="step-4.-draft-the-eight-sections"/>
+    <w:bookmarkEnd w:id="39"/>
+    <w:bookmarkStart w:id="49" w:name="step-4.-draft-the-eight-sections"/>
     <w:p>
       <w:pPr>
         <w:pStyle w:val="Heading2"/>
       </w:pPr>
       <w:r>
+        <w:rPr>
+          <w:rStyle w:val="SectionNumber"/>
+        </w:rPr>
+        <w:t xml:space="preserve">1.16</w:t>
+      </w:r>
+      <w:r>
+        <w:tab/>
+      </w:r>
+      <w:r>
         <w:t xml:space="preserve">Step 4. Draft the eight sections</w:t>
       </w:r>
     </w:p>
@@ -5537,12 +4501,21 @@
         <w:t xml:space="preserve">Produce all eight sections of the report in drafting mode. Do not write to disk yet.</w:t>
       </w:r>
     </w:p>
-    <w:bookmarkStart w:id="52" w:name="section-1.-own-site-content-inventory"/>
+    <w:bookmarkStart w:id="40" w:name="section-1.-own-site-content-inventory"/>
     <w:p>
       <w:pPr>
         <w:pStyle w:val="Heading3"/>
       </w:pPr>
       <w:r>
+        <w:rPr>
+          <w:rStyle w:val="SectionNumber"/>
+        </w:rPr>
+        <w:t xml:space="preserve">1.16.1</w:t>
+      </w:r>
+      <w:r>
+        <w:tab/>
+      </w:r>
+      <w:r>
         <w:t xml:space="preserve">Section 1. Own-site content inventory</w:t>
       </w:r>
     </w:p>
@@ -5615,13 +4588,22 @@
         <w:t xml:space="preserve">plus a 200-word narrative.</w:t>
       </w:r>
     </w:p>
-    <w:bookmarkEnd w:id="52"/>
-    <w:bookmarkStart w:id="53" w:name="section-2.-competitor-content-footprint"/>
+    <w:bookmarkEnd w:id="40"/>
+    <w:bookmarkStart w:id="41" w:name="section-2.-competitor-content-footprint"/>
     <w:p>
       <w:pPr>
         <w:pStyle w:val="Heading3"/>
       </w:pPr>
       <w:r>
+        <w:rPr>
+          <w:rStyle w:val="SectionNumber"/>
+        </w:rPr>
+        <w:t xml:space="preserve">1.16.2</w:t>
+      </w:r>
+      <w:r>
+        <w:tab/>
+      </w:r>
+      <w:r>
         <w:t xml:space="preserve">Section 2. Competitor content footprint</w:t>
       </w:r>
     </w:p>
@@ -5677,13 +4659,22 @@
         <w:t xml:space="preserve">Deliverable: per-competitor CSV plus a 150-word narrative per competitor.</w:t>
       </w:r>
     </w:p>
-    <w:bookmarkEnd w:id="53"/>
-    <w:bookmarkStart w:id="54" w:name="section-3.-keyword-gap"/>
+    <w:bookmarkEnd w:id="41"/>
+    <w:bookmarkStart w:id="42" w:name="section-3.-keyword-gap"/>
     <w:p>
       <w:pPr>
         <w:pStyle w:val="Heading3"/>
       </w:pPr>
       <w:r>
+        <w:rPr>
+          <w:rStyle w:val="SectionNumber"/>
+        </w:rPr>
+        <w:t xml:space="preserve">1.16.3</w:t>
+      </w:r>
+      <w:r>
+        <w:tab/>
+      </w:r>
+      <w:r>
         <w:t xml:space="preserve">Section 3. Keyword gap</w:t>
       </w:r>
     </w:p>
@@ -5692,7 +4683,7 @@
         <w:pStyle w:val="FirstParagraph"/>
       </w:pPr>
       <w:r>
-        <w:t xml:space="preserve">Set-difference analysis.</w:t>
+        <w:t xml:space="preserve">Set-difference analysis, then consolidation.</w:t>
       </w:r>
       <w:r>
         <w:t xml:space="preserve"> </w:t>
@@ -5740,7 +4731,107 @@
         <w:t xml:space="preserve"> </w:t>
       </w:r>
       <w:r>
-        <w:t xml:space="preserve">in Python. Union across all competitors to form the full gap list.</w:t>
+        <w:t xml:space="preserve">in Python. Save per-competitor output as</w:t>
+      </w:r>
+      <w:r>
+        <w:t xml:space="preserve"> </w:t>
+      </w:r>
+      <w:r>
+        <w:rPr>
+          <w:rStyle w:val="VerbatimChar"/>
+        </w:rPr>
+        <w:t xml:space="preserve">keyword-gap-vs-{competitor}.csv</w:t>
+      </w:r>
+      <w:r>
+        <w:t xml:space="preserve">.</w:t>
+      </w:r>
+      <w:r>
+        <w:t xml:space="preserve"> </w:t>
+      </w:r>
+      <w:r>
+        <w:t xml:space="preserve">-</w:t>
+      </w:r>
+      <w:r>
+        <w:t xml:space="preserve"> </w:t>
+      </w:r>
+      <w:r>
+        <w:rPr>
+          <w:b/>
+          <w:bCs/>
+        </w:rPr>
+        <w:t xml:space="preserve">Union across all competitors into one deduped master dataset.</w:t>
+      </w:r>
+      <w:r>
+        <w:t xml:space="preserve"> </w:t>
+      </w:r>
+      <w:r>
+        <w:t xml:space="preserve">For each keyword in the union, compute</w:t>
+      </w:r>
+      <w:r>
+        <w:t xml:space="preserve"> </w:t>
+      </w:r>
+      <w:r>
+        <w:rPr>
+          <w:rStyle w:val="VerbatimChar"/>
+        </w:rPr>
+        <w:t xml:space="preserve">num_competitors_ranking</w:t>
+      </w:r>
+      <w:r>
+        <w:t xml:space="preserve">,</w:t>
+      </w:r>
+      <w:r>
+        <w:t xml:space="preserve"> </w:t>
+      </w:r>
+      <w:r>
+        <w:rPr>
+          <w:rStyle w:val="VerbatimChar"/>
+        </w:rPr>
+        <w:t xml:space="preserve">aggregate_volume</w:t>
+      </w:r>
+      <w:r>
+        <w:t xml:space="preserve"> </w:t>
+      </w:r>
+      <w:r>
+        <w:t xml:space="preserve">(max observed across competitors, since one query has one underlying volume),</w:t>
+      </w:r>
+      <w:r>
+        <w:t xml:space="preserve"> </w:t>
+      </w:r>
+      <w:r>
+        <w:rPr>
+          <w:rStyle w:val="VerbatimChar"/>
+        </w:rPr>
+        <w:t xml:space="preserve">max_difficulty</w:t>
+      </w:r>
+      <w:r>
+        <w:t xml:space="preserve">,</w:t>
+      </w:r>
+      <w:r>
+        <w:t xml:space="preserve"> </w:t>
+      </w:r>
+      <w:r>
+        <w:rPr>
+          <w:rStyle w:val="VerbatimChar"/>
+        </w:rPr>
+        <w:t xml:space="preserve">best_competitor_position</w:t>
+      </w:r>
+      <w:r>
+        <w:t xml:space="preserve">,</w:t>
+      </w:r>
+      <w:r>
+        <w:t xml:space="preserve"> </w:t>
+      </w:r>
+      <w:r>
+        <w:rPr>
+          <w:rStyle w:val="VerbatimChar"/>
+        </w:rPr>
+        <w:t xml:space="preserve">client_ranks</w:t>
+      </w:r>
+      <w:r>
+        <w:t xml:space="preserve"> </w:t>
+      </w:r>
+      <w:r>
+        <w:t xml:space="preserve">(boolean).</w:t>
       </w:r>
       <w:r>
         <w:t xml:space="preserve"> </w:t>
@@ -5754,12 +4845,388 @@
       <w:r>
         <w:t xml:space="preserve">- Enrich each surviving keyword: SERP intent (informational, commercial, transactional, navigational), CPC, SERP features present.</w:t>
       </w:r>
+      <w:r>
+        <w:t xml:space="preserve"> </w:t>
+      </w:r>
+      <w:r>
+        <w:t xml:space="preserve">- Score each keyword:</w:t>
+      </w:r>
+      <w:r>
+        <w:t xml:space="preserve"> </w:t>
+      </w:r>
+      <w:r>
+        <w:rPr>
+          <w:rStyle w:val="VerbatimChar"/>
+        </w:rPr>
+        <w:t xml:space="preserve">opportunity = aggregate_volume × num_competitors_ranking × max(1, 101 - max_difficulty) × (1 if not client_ranks else 0.3)</w:t>
+      </w:r>
+      <w:r>
+        <w:t xml:space="preserve">. The</w:t>
+      </w:r>
+      <w:r>
+        <w:t xml:space="preserve"> </w:t>
+      </w:r>
+      <w:r>
+        <w:rPr>
+          <w:rStyle w:val="VerbatimChar"/>
+        </w:rPr>
+        <w:t xml:space="preserve">(101 - max_difficulty)</w:t>
+      </w:r>
+      <w:r>
+        <w:t xml:space="preserve"> </w:t>
+      </w:r>
+      <w:r>
+        <w:t xml:space="preserve">factor keeps the score positive across DataForSEO’s 0-100 KD scale. Rank descending.</w:t>
+      </w:r>
     </w:p>
     <w:p>
       <w:pPr>
         <w:pStyle w:val="BodyText"/>
       </w:pPr>
       <w:r>
+        <w:t xml:space="preserve">Deliverables:</w:t>
+      </w:r>
+      <w:r>
+        <w:t xml:space="preserve"> </w:t>
+      </w:r>
+      <w:r>
+        <w:t xml:space="preserve">-</w:t>
+      </w:r>
+      <w:r>
+        <w:t xml:space="preserve"> </w:t>
+      </w:r>
+      <w:r>
+        <w:rPr>
+          <w:rStyle w:val="VerbatimChar"/>
+        </w:rPr>
+        <w:t xml:space="preserve">data/content-gap/{YYYY-MM-DD}/keyword-gap-consolidated.csv</w:t>
+      </w:r>
+      <w:r>
+        <w:t xml:space="preserve"> </w:t>
+      </w:r>
+      <w:r>
+        <w:t xml:space="preserve">(unioned, enriched, scored master). This is the primary keyword artefact.</w:t>
+      </w:r>
+      <w:r>
+        <w:t xml:space="preserve"> </w:t>
+      </w:r>
+      <w:r>
+        <w:t xml:space="preserve">-</w:t>
+      </w:r>
+      <w:r>
+        <w:t xml:space="preserve"> </w:t>
+      </w:r>
+      <w:r>
+        <w:rPr>
+          <w:rStyle w:val="VerbatimChar"/>
+        </w:rPr>
+        <w:t xml:space="preserve">data/content-gap/{YYYY-MM-DD}/keyword-gap-vs-{competitor}.csv</w:t>
+      </w:r>
+      <w:r>
+        <w:t xml:space="preserve"> </w:t>
+      </w:r>
+      <w:r>
+        <w:t xml:space="preserve">(per-competitor raw output, retained as evidence).</w:t>
+      </w:r>
+      <w:r>
+        <w:t xml:space="preserve"> </w:t>
+      </w:r>
+      <w:r>
+        <w:t xml:space="preserve">- A 200-word narrative on the 3 to 5 themes dominating the gap.</w:t>
+      </w:r>
+    </w:p>
+    <w:p>
+      <w:pPr>
+        <w:pStyle w:val="BodyText"/>
+      </w:pPr>
+      <w:r>
+        <w:rPr>
+          <w:b/>
+          <w:bCs/>
+        </w:rPr>
+        <w:t xml:space="preserve">Critical tool-note:</w:t>
+      </w:r>
+      <w:r>
+        <w:t xml:space="preserve"> </w:t>
+      </w:r>
+      <w:r>
+        <w:t xml:space="preserve">do not use</w:t>
+      </w:r>
+      <w:r>
+        <w:t xml:space="preserve"> </w:t>
+      </w:r>
+      <w:r>
+        <w:rPr>
+          <w:rStyle w:val="VerbatimChar"/>
+        </w:rPr>
+        <w:t xml:space="preserve">seo_toolkit.py keyword-research</w:t>
+      </w:r>
+      <w:r>
+        <w:t xml:space="preserve"> </w:t>
+      </w:r>
+      <w:r>
+        <w:t xml:space="preserve">gap mode or DataForSEO</w:t>
+      </w:r>
+      <w:r>
+        <w:t xml:space="preserve"> </w:t>
+      </w:r>
+      <w:r>
+        <w:rPr>
+          <w:rStyle w:val="VerbatimChar"/>
+        </w:rPr>
+        <w:t xml:space="preserve">labs_keyword_intersection</w:t>
+      </w:r>
+      <w:r>
+        <w:t xml:space="preserve">. Both return intersections (keywords both domains rank for) when the analysis needs the set difference. Compute the delta manually in Python.</w:t>
+      </w:r>
+    </w:p>
+    <w:p>
+      <w:pPr>
+        <w:pStyle w:val="BodyText"/>
+      </w:pPr>
+      <w:r>
+        <w:rPr>
+          <w:b/>
+          <w:bCs/>
+        </w:rPr>
+        <w:t xml:space="preserve">On-page-signal fallback.</w:t>
+      </w:r>
+      <w:r>
+        <w:t xml:space="preserve"> </w:t>
+      </w:r>
+      <w:r>
+        <w:t xml:space="preserve">When DataForSEO and Ahrefs are both unavailable: WebFetch each competitor’s and the client’s homepage, top 10 nav links, top 5 collection pages, top 5 PDPs, blog index. Extract titles, meta descriptions, H1/H2 blocks, URL slug tokens, schema markup, anchor text. Produce</w:t>
+      </w:r>
+      <w:r>
+        <w:t xml:space="preserve"> </w:t>
+      </w:r>
+      <w:r>
+        <w:rPr>
+          <w:rStyle w:val="VerbatimChar"/>
+        </w:rPr>
+        <w:t xml:space="preserve">fallback-onpage-signals.csv</w:t>
+      </w:r>
+      <w:r>
+        <w:t xml:space="preserve"> </w:t>
+      </w:r>
+      <w:r>
+        <w:t xml:space="preserve">per domain. Run Section 3 consolidation on this reduced dataset and label deliverables</w:t>
+      </w:r>
+      <w:r>
+        <w:t xml:space="preserve"> </w:t>
+      </w:r>
+      <w:r>
+        <w:t xml:space="preserve">“on-page signals only, no ranking or volume data”</w:t>
+      </w:r>
+      <w:r>
+        <w:t xml:space="preserve">. Sections 4 through 8 still run on the reduced universe; be honest about its limitations in the narrative.</w:t>
+      </w:r>
+    </w:p>
+    <w:bookmarkEnd w:id="42"/>
+    <w:bookmarkStart w:id="43" w:name="section-3.5.-serp-feature-mining"/>
+    <w:p>
+      <w:pPr>
+        <w:pStyle w:val="Heading3"/>
+      </w:pPr>
+      <w:r>
+        <w:rPr>
+          <w:rStyle w:val="SectionNumber"/>
+        </w:rPr>
+        <w:t xml:space="preserve">1.16.4</w:t>
+      </w:r>
+      <w:r>
+        <w:tab/>
+      </w:r>
+      <w:r>
+        <w:t xml:space="preserve">Section 3.5. SERP-feature mining</w:t>
+      </w:r>
+    </w:p>
+    <w:p>
+      <w:pPr>
+        <w:pStyle w:val="FirstParagraph"/>
+      </w:pPr>
+      <w:r>
+        <w:t xml:space="preserve">PAA questions, related searches, and Google autocomplete reveal how buyers phrase queries in their own words. These frequently diverge from the head-term vocabulary the ranked-keyword pull captures. Mining them surfaces long-tail refinements, FAQ candidates, and AEO-extractable angles the Section 3 set-difference misses.</w:t>
+      </w:r>
+    </w:p>
+    <w:p>
+      <w:pPr>
+        <w:pStyle w:val="BodyText"/>
+      </w:pPr>
+      <w:r>
+        <w:t xml:space="preserve">For the top 20 to 30 head-term queries from the consolidated universe (sorted by opportunity score, skipping any the client already owns position 1):</w:t>
+      </w:r>
+      <w:r>
+        <w:t xml:space="preserve"> </w:t>
+      </w:r>
+      <w:r>
+        <w:t xml:space="preserve">- Serper</w:t>
+      </w:r>
+      <w:r>
+        <w:t xml:space="preserve"> </w:t>
+      </w:r>
+      <w:r>
+        <w:rPr>
+          <w:rStyle w:val="VerbatimChar"/>
+        </w:rPr>
+        <w:t xml:space="preserve">/search</w:t>
+      </w:r>
+      <w:r>
+        <w:t xml:space="preserve"> </w:t>
+      </w:r>
+      <w:r>
+        <w:t xml:space="preserve">on each head-term. Parse</w:t>
+      </w:r>
+      <w:r>
+        <w:t xml:space="preserve"> </w:t>
+      </w:r>
+      <w:r>
+        <w:rPr>
+          <w:rStyle w:val="VerbatimChar"/>
+        </w:rPr>
+        <w:t xml:space="preserve">peopleAlsoAsk[]</w:t>
+      </w:r>
+      <w:r>
+        <w:t xml:space="preserve"> </w:t>
+      </w:r>
+      <w:r>
+        <w:t xml:space="preserve">and</w:t>
+      </w:r>
+      <w:r>
+        <w:t xml:space="preserve"> </w:t>
+      </w:r>
+      <w:r>
+        <w:rPr>
+          <w:rStyle w:val="VerbatimChar"/>
+        </w:rPr>
+        <w:t xml:space="preserve">relatedSearches[]</w:t>
+      </w:r>
+      <w:r>
+        <w:t xml:space="preserve">.</w:t>
+      </w:r>
+      <w:r>
+        <w:t xml:space="preserve"> </w:t>
+      </w:r>
+      <w:r>
+        <w:t xml:space="preserve">- Serper</w:t>
+      </w:r>
+      <w:r>
+        <w:t xml:space="preserve"> </w:t>
+      </w:r>
+      <w:r>
+        <w:rPr>
+          <w:rStyle w:val="VerbatimChar"/>
+        </w:rPr>
+        <w:t xml:space="preserve">/autocomplete</w:t>
+      </w:r>
+      <w:r>
+        <w:t xml:space="preserve"> </w:t>
+      </w:r>
+      <w:r>
+        <w:t xml:space="preserve">on each head-term plus pattern-completions:</w:t>
+      </w:r>
+      <w:r>
+        <w:t xml:space="preserve"> </w:t>
+      </w:r>
+      <w:r>
+        <w:rPr>
+          <w:rStyle w:val="VerbatimChar"/>
+        </w:rPr>
+        <w:t xml:space="preserve">{head_term}</w:t>
+      </w:r>
+      <w:r>
+        <w:t xml:space="preserve">,</w:t>
+      </w:r>
+      <w:r>
+        <w:t xml:space="preserve"> </w:t>
+      </w:r>
+      <w:r>
+        <w:rPr>
+          <w:rStyle w:val="VerbatimChar"/>
+        </w:rPr>
+        <w:t xml:space="preserve">best {head_term}</w:t>
+      </w:r>
+      <w:r>
+        <w:t xml:space="preserve">,</w:t>
+      </w:r>
+      <w:r>
+        <w:t xml:space="preserve"> </w:t>
+      </w:r>
+      <w:r>
+        <w:rPr>
+          <w:rStyle w:val="VerbatimChar"/>
+        </w:rPr>
+        <w:t xml:space="preserve">how to {head_term}</w:t>
+      </w:r>
+      <w:r>
+        <w:t xml:space="preserve">.</w:t>
+      </w:r>
+      <w:r>
+        <w:t xml:space="preserve"> </w:t>
+      </w:r>
+      <w:r>
+        <w:t xml:space="preserve">- If Serper is unavailable:</w:t>
+      </w:r>
+      <w:r>
+        <w:t xml:space="preserve"> </w:t>
+      </w:r>
+      <w:r>
+        <w:rPr>
+          <w:rStyle w:val="VerbatimChar"/>
+        </w:rPr>
+        <w:t xml:space="preserve">WebSearch</w:t>
+      </w:r>
+      <w:r>
+        <w:t xml:space="preserve"> </w:t>
+      </w:r>
+      <w:r>
+        <w:t xml:space="preserve">returns related-searches reliably. Autocomplete fallback is a manual incognito-Chrome capture exported to CSV.</w:t>
+      </w:r>
+    </w:p>
+    <w:p>
+      <w:pPr>
+        <w:pStyle w:val="BodyText"/>
+      </w:pPr>
+      <w:r>
+        <w:t xml:space="preserve">Compile output:</w:t>
+      </w:r>
+      <w:r>
+        <w:t xml:space="preserve"> </w:t>
+      </w:r>
+      <w:r>
+        <w:rPr>
+          <w:rStyle w:val="VerbatimChar"/>
+        </w:rPr>
+        <w:t xml:space="preserve">data/content-gap/{YYYY-MM-DD}/serp-features-mined.csv</w:t>
+      </w:r>
+      <w:r>
+        <w:t xml:space="preserve"> </w:t>
+      </w:r>
+      <w:r>
+        <w:t xml:space="preserve">with columns: head_term, feature_type (paa / related / autocomplete), text, implied_intent, semantic_cluster.</w:t>
+      </w:r>
+    </w:p>
+    <w:p>
+      <w:pPr>
+        <w:pStyle w:val="BodyText"/>
+      </w:pPr>
+      <w:r>
+        <w:t xml:space="preserve">Cluster the mined phrases against the Section 3 keyword clusters. Phrases that do not fit any existing cluster typically surface a new long-tail cluster the gap analysis missed; flag these explicitly.</w:t>
+      </w:r>
+    </w:p>
+    <w:p>
+      <w:pPr>
+        <w:pStyle w:val="BodyText"/>
+      </w:pPr>
+      <w:r>
+        <w:t xml:space="preserve">Any mined phrase the client’s existing content does not address becomes a candidate for: an FAQ block on an existing page, an H3 section inside an existing pillar, or a dedicated page where volume justifies it. This output feeds directly into Section 7 pillar planning and Section 4 AEO citation remediation.</w:t>
+      </w:r>
+    </w:p>
+    <w:p>
+      <w:pPr>
+        <w:pStyle w:val="BodyText"/>
+      </w:pPr>
+      <w:r>
         <w:t xml:space="preserve">Deliverable:</w:t>
       </w:r>
       <w:r>
@@ -5769,13 +5236,88 @@
         <w:rPr>
           <w:rStyle w:val="VerbatimChar"/>
         </w:rPr>
-        <w:t xml:space="preserve">data/content-gap/{YYYY-MM-DD}/keyword-gap-raw.csv</w:t>
-      </w:r>
-      <w:r>
-        <w:t xml:space="preserve"> </w:t>
-      </w:r>
-      <w:r>
-        <w:t xml:space="preserve">plus a 200-word narrative on the 3 to 5 themes dominating the gap.</w:t>
+        <w:t xml:space="preserve">serp-features-mined.csv</w:t>
+      </w:r>
+      <w:r>
+        <w:t xml:space="preserve"> </w:t>
+      </w:r>
+      <w:r>
+        <w:t xml:space="preserve">plus a 150-word narrative on the 3 to 5 most surprising buyer-language patterns.</w:t>
+      </w:r>
+    </w:p>
+    <w:bookmarkEnd w:id="43"/>
+    <w:bookmarkStart w:id="44" w:name="section-4.-aeo-citation-audit"/>
+    <w:p>
+      <w:pPr>
+        <w:pStyle w:val="Heading3"/>
+      </w:pPr>
+      <w:r>
+        <w:rPr>
+          <w:rStyle w:val="SectionNumber"/>
+        </w:rPr>
+        <w:t xml:space="preserve">1.16.5</w:t>
+      </w:r>
+      <w:r>
+        <w:tab/>
+      </w:r>
+      <w:r>
+        <w:t xml:space="preserve">Section 4. AEO citation audit</w:t>
+      </w:r>
+    </w:p>
+    <w:p>
+      <w:pPr>
+        <w:pStyle w:val="FirstParagraph"/>
+      </w:pPr>
+      <w:r>
+        <w:t xml:space="preserve">External layer.</w:t>
+      </w:r>
+      <w:r>
+        <w:t xml:space="preserve"> </w:t>
+      </w:r>
+      <w:r>
+        <w:t xml:space="preserve">- Draft 30 to 50 category questions covering the full buyer journey. Cover early-stage (</w:t>
+      </w:r>
+      <w:r>
+        <w:t xml:space="preserve">“what is X”</w:t>
+      </w:r>
+      <w:r>
+        <w:t xml:space="preserve">), mid-stage comparison (</w:t>
+      </w:r>
+      <w:r>
+        <w:t xml:space="preserve">“X vs Y”</w:t>
+      </w:r>
+      <w:r>
+        <w:t xml:space="preserve">), late-stage commercial (</w:t>
+      </w:r>
+      <w:r>
+        <w:t xml:space="preserve">“best X for Y”</w:t>
+      </w:r>
+      <w:r>
+        <w:t xml:space="preserve">), post-purchase support (</w:t>
+      </w:r>
+      <w:r>
+        <w:t xml:space="preserve">“how to use X”</w:t>
+      </w:r>
+      <w:r>
+        <w:t xml:space="preserve">).</w:t>
+      </w:r>
+      <w:r>
+        <w:t xml:space="preserve"> </w:t>
+      </w:r>
+      <w:r>
+        <w:t xml:space="preserve">- Probe each question across ChatGPT (with browsing), Claude (with web search), Perplexity, Google AI Overview (via Serper).</w:t>
+      </w:r>
+      <w:r>
+        <w:t xml:space="preserve"> </w:t>
+      </w:r>
+      <w:r>
+        <w:t xml:space="preserve">- Record: is the client cited, which competitors are cited, does an AI Overview or LLM answer exist, what sources are cited.</w:t>
+      </w:r>
+      <w:r>
+        <w:t xml:space="preserve"> </w:t>
+      </w:r>
+      <w:r>
+        <w:t xml:space="preserve">- Classify each question into: competitor-owned, category-whitespace, client-present, unanswered.</w:t>
       </w:r>
     </w:p>
     <w:p>
@@ -5783,54 +5325,41 @@
         <w:pStyle w:val="BodyText"/>
       </w:pPr>
       <w:r>
-        <w:rPr>
-          <w:b/>
-          <w:bCs/>
-        </w:rPr>
-        <w:t xml:space="preserve">Critical tool-note:</w:t>
-      </w:r>
-      <w:r>
-        <w:t xml:space="preserve"> </w:t>
-      </w:r>
-      <w:r>
-        <w:t xml:space="preserve">do not use</w:t>
-      </w:r>
-      <w:r>
-        <w:t xml:space="preserve"> </w:t>
-      </w:r>
-      <w:r>
-        <w:rPr>
-          <w:rStyle w:val="VerbatimChar"/>
-        </w:rPr>
-        <w:t xml:space="preserve">seo_toolkit.py keyword-research</w:t>
-      </w:r>
-      <w:r>
-        <w:t xml:space="preserve"> </w:t>
-      </w:r>
-      <w:r>
-        <w:t xml:space="preserve">gap mode or DataForSEO</w:t>
-      </w:r>
-      <w:r>
-        <w:t xml:space="preserve"> </w:t>
-      </w:r>
-      <w:r>
-        <w:rPr>
-          <w:rStyle w:val="VerbatimChar"/>
-        </w:rPr>
-        <w:t xml:space="preserve">labs_keyword_intersection</w:t>
-      </w:r>
-      <w:r>
-        <w:t xml:space="preserve">. Both return intersections (keywords both domains rank for) when the analysis needs the set difference. Compute the delta manually in Python.</w:t>
-      </w:r>
-    </w:p>
-    <w:bookmarkEnd w:id="54"/>
-    <w:bookmarkStart w:id="55" w:name="section-4.-aeo-citation-audit"/>
+        <w:t xml:space="preserve">Deliverable:</w:t>
+      </w:r>
+      <w:r>
+        <w:t xml:space="preserve"> </w:t>
+      </w:r>
+      <w:r>
+        <w:rPr>
+          <w:rStyle w:val="VerbatimChar"/>
+        </w:rPr>
+        <w:t xml:space="preserve">data/content-gap/{YYYY-MM-DD}/aeo-probe-log.csv</w:t>
+      </w:r>
+      <w:r>
+        <w:t xml:space="preserve"> </w:t>
+      </w:r>
+      <w:r>
+        <w:t xml:space="preserve">plus a 250-word narrative.</w:t>
+      </w:r>
+    </w:p>
+    <w:bookmarkEnd w:id="44"/>
+    <w:bookmarkStart w:id="45" w:name="Xc9d6fe8196573a7d4c28746d9be9dfdb790fb19"/>
     <w:p>
       <w:pPr>
         <w:pStyle w:val="Heading3"/>
       </w:pPr>
       <w:r>
-        <w:t xml:space="preserve">Section 4. AEO citation audit</w:t>
+        <w:rPr>
+          <w:rStyle w:val="SectionNumber"/>
+        </w:rPr>
+        <w:t xml:space="preserve">1.16.6</w:t>
+      </w:r>
+      <w:r>
+        <w:tab/>
+      </w:r>
+      <w:r>
+        <w:t xml:space="preserve">Section 5. SERP intent map and topic clusters</w:t>
       </w:r>
     </w:p>
     <w:p>
@@ -5838,55 +5367,37 @@
         <w:pStyle w:val="FirstParagraph"/>
       </w:pPr>
       <w:r>
-        <w:t xml:space="preserve">External layer.</w:t>
-      </w:r>
-      <w:r>
-        <w:t xml:space="preserve"> </w:t>
-      </w:r>
-      <w:r>
-        <w:t xml:space="preserve">- Draft 30 to 50 category questions covering the full buyer journey. Cover early-stage (</w:t>
-      </w:r>
-      <w:r>
-        <w:t xml:space="preserve">“what is X”</w:t>
-      </w:r>
-      <w:r>
-        <w:t xml:space="preserve">), mid-stage comparison (</w:t>
-      </w:r>
-      <w:r>
-        <w:t xml:space="preserve">“X vs Y”</w:t>
-      </w:r>
-      <w:r>
-        <w:t xml:space="preserve">), late-stage commercial (</w:t>
-      </w:r>
-      <w:r>
-        <w:t xml:space="preserve">“best X for Y”</w:t>
-      </w:r>
-      <w:r>
-        <w:t xml:space="preserve">), post-purchase support (</w:t>
-      </w:r>
-      <w:r>
-        <w:t xml:space="preserve">“how to use X”</w:t>
-      </w:r>
-      <w:r>
-        <w:t xml:space="preserve">).</w:t>
-      </w:r>
-      <w:r>
-        <w:t xml:space="preserve"> </w:t>
-      </w:r>
-      <w:r>
-        <w:t xml:space="preserve">- Probe each question across ChatGPT (with browsing), Claude (with web search), Perplexity, Google AI Overview (via Serper).</w:t>
-      </w:r>
-      <w:r>
-        <w:t xml:space="preserve"> </w:t>
-      </w:r>
-      <w:r>
-        <w:t xml:space="preserve">- Record: is the client cited, which competitors are cited, does an AI Overview or LLM answer exist, what sources are cited.</w:t>
-      </w:r>
-      <w:r>
-        <w:t xml:space="preserve"> </w:t>
-      </w:r>
-      <w:r>
-        <w:t xml:space="preserve">- Classify each question into: competitor-owned, category-whitespace, client-present, unanswered.</w:t>
+        <w:t xml:space="preserve">Cluster every keyword from Section 3 and every question from Section 4 into 4 to 8 topic clusters.</w:t>
+      </w:r>
+      <w:r>
+        <w:t xml:space="preserve"> </w:t>
+      </w:r>
+      <w:r>
+        <w:t xml:space="preserve">- Start from Section 2’s competitor cluster labels as the initial taxonomy.</w:t>
+      </w:r>
+      <w:r>
+        <w:t xml:space="preserve"> </w:t>
+      </w:r>
+      <w:r>
+        <w:t xml:space="preserve">- Keep labels in the ICP’s register.</w:t>
+      </w:r>
+      <w:r>
+        <w:t xml:space="preserve"> </w:t>
+      </w:r>
+      <w:r>
+        <w:t xml:space="preserve">- Within each cluster, map every keyword and question to SERP intent.</w:t>
+      </w:r>
+      <w:r>
+        <w:t xml:space="preserve"> </w:t>
+      </w:r>
+      <w:r>
+        <w:t xml:space="preserve">- Identify the pillar opportunity per cluster (highest-volume informational keyword).</w:t>
+      </w:r>
+      <w:r>
+        <w:t xml:space="preserve"> </w:t>
+      </w:r>
+      <w:r>
+        <w:t xml:space="preserve">- Flag clusters where the keyword layer and AEO layer both show whitespace. These are double-hit clusters. Promote them in Section 7.</w:t>
       </w:r>
     </w:p>
     <w:p>
@@ -5903,89 +5414,27 @@
         <w:rPr>
           <w:rStyle w:val="VerbatimChar"/>
         </w:rPr>
-        <w:t xml:space="preserve">data/content-gap/{YYYY-MM-DD}/aeo-probe-log.csv</w:t>
-      </w:r>
-      <w:r>
-        <w:t xml:space="preserve"> </w:t>
-      </w:r>
-      <w:r>
-        <w:t xml:space="preserve">plus a 250-word narrative.</w:t>
-      </w:r>
-    </w:p>
-    <w:bookmarkEnd w:id="55"/>
-    <w:bookmarkStart w:id="56" w:name="Xc9d6fe8196573a7d4c28746d9be9dfdb790fb19"/>
+        <w:t xml:space="preserve">data/content-gap/{YYYY-MM-DD}/clusters.md</w:t>
+      </w:r>
+      <w:r>
+        <w:t xml:space="preserve">.</w:t>
+      </w:r>
+    </w:p>
+    <w:bookmarkEnd w:id="45"/>
+    <w:bookmarkStart w:id="46" w:name="section-6.-opportunity-scoring"/>
     <w:p>
       <w:pPr>
         <w:pStyle w:val="Heading3"/>
       </w:pPr>
       <w:r>
-        <w:t xml:space="preserve">Section 5. SERP intent map and topic clusters</w:t>
-      </w:r>
-    </w:p>
-    <w:p>
-      <w:pPr>
-        <w:pStyle w:val="FirstParagraph"/>
-      </w:pPr>
-      <w:r>
-        <w:t xml:space="preserve">Cluster every keyword from Section 3 and every question from Section 4 into 4 to 8 topic clusters.</w:t>
-      </w:r>
-      <w:r>
-        <w:t xml:space="preserve"> </w:t>
-      </w:r>
-      <w:r>
-        <w:t xml:space="preserve">- Start from Section 2’s competitor cluster labels as the initial taxonomy.</w:t>
-      </w:r>
-      <w:r>
-        <w:t xml:space="preserve"> </w:t>
-      </w:r>
-      <w:r>
-        <w:t xml:space="preserve">- Keep labels in the ICP’s register.</w:t>
-      </w:r>
-      <w:r>
-        <w:t xml:space="preserve"> </w:t>
-      </w:r>
-      <w:r>
-        <w:t xml:space="preserve">- Within each cluster, map every keyword and question to SERP intent.</w:t>
-      </w:r>
-      <w:r>
-        <w:t xml:space="preserve"> </w:t>
-      </w:r>
-      <w:r>
-        <w:t xml:space="preserve">- Identify the pillar opportunity per cluster (highest-volume informational keyword).</w:t>
-      </w:r>
-      <w:r>
-        <w:t xml:space="preserve"> </w:t>
-      </w:r>
-      <w:r>
-        <w:t xml:space="preserve">- Flag clusters where the keyword layer and AEO layer both show whitespace. These are double-hit clusters. Promote them in Section 7.</w:t>
-      </w:r>
-    </w:p>
-    <w:p>
-      <w:pPr>
-        <w:pStyle w:val="BodyText"/>
-      </w:pPr>
-      <w:r>
-        <w:t xml:space="preserve">Deliverable:</w:t>
-      </w:r>
-      <w:r>
-        <w:t xml:space="preserve"> </w:t>
-      </w:r>
-      <w:r>
-        <w:rPr>
-          <w:rStyle w:val="VerbatimChar"/>
-        </w:rPr>
-        <w:t xml:space="preserve">data/content-gap/{YYYY-MM-DD}/clusters.md</w:t>
-      </w:r>
-      <w:r>
-        <w:t xml:space="preserve">.</w:t>
-      </w:r>
-    </w:p>
-    <w:bookmarkEnd w:id="56"/>
-    <w:bookmarkStart w:id="57" w:name="section-6.-opportunity-scoring"/>
-    <w:p>
-      <w:pPr>
-        <w:pStyle w:val="Heading3"/>
-      </w:pPr>
+        <w:rPr>
+          <w:rStyle w:val="SectionNumber"/>
+        </w:rPr>
+        <w:t xml:space="preserve">1.16.7</w:t>
+      </w:r>
+      <w:r>
+        <w:tab/>
+      </w:r>
       <w:r>
         <w:t xml:space="preserve">Section 6. Opportunity scoring</w:t>
       </w:r>
@@ -6269,13 +5718,22 @@
         <w:t xml:space="preserve">.</w:t>
       </w:r>
     </w:p>
-    <w:bookmarkEnd w:id="57"/>
-    <w:bookmarkStart w:id="58" w:name="section-7.-content-pillar-cluster-plan"/>
+    <w:bookmarkEnd w:id="46"/>
+    <w:bookmarkStart w:id="47" w:name="section-7.-content-pillar-cluster-plan"/>
     <w:p>
       <w:pPr>
         <w:pStyle w:val="Heading3"/>
       </w:pPr>
       <w:r>
+        <w:rPr>
+          <w:rStyle w:val="SectionNumber"/>
+        </w:rPr>
+        <w:t xml:space="preserve">1.16.8</w:t>
+      </w:r>
+      <w:r>
+        <w:tab/>
+      </w:r>
+      <w:r>
         <w:t xml:space="preserve">Section 7. Content pillar + cluster plan</w:t>
       </w:r>
     </w:p>
@@ -6383,12 +5841,21 @@
         <w:t xml:space="preserve">Deliverable: the cluster plan, 4 to 8 clusters with 20 to 40 sub-pages.</w:t>
       </w:r>
     </w:p>
-    <w:bookmarkEnd w:id="58"/>
-    <w:bookmarkStart w:id="59" w:name="section-8.-top-10-full-content-briefs"/>
+    <w:bookmarkEnd w:id="47"/>
+    <w:bookmarkStart w:id="48" w:name="section-8.-top-10-full-content-briefs"/>
     <w:p>
       <w:pPr>
         <w:pStyle w:val="Heading3"/>
       </w:pPr>
+      <w:r>
+        <w:rPr>
+          <w:rStyle w:val="SectionNumber"/>
+        </w:rPr>
+        <w:t xml:space="preserve">1.16.9</w:t>
+      </w:r>
+      <w:r>
+        <w:tab/>
+      </w:r>
       <w:r>
         <w:t xml:space="preserve">Section 8. Top 10 full content briefs</w:t>
       </w:r>
@@ -6406,7 +5873,7 @@
         <w:pStyle w:val="Compact"/>
         <w:numPr>
           <w:ilvl w:val="0"/>
-          <w:numId w:val="1031"/>
+          <w:numId w:val="1020"/>
         </w:numPr>
       </w:pPr>
       <w:r>
@@ -6428,7 +5895,7 @@
         <w:pStyle w:val="Compact"/>
         <w:numPr>
           <w:ilvl w:val="0"/>
-          <w:numId w:val="1031"/>
+          <w:numId w:val="1020"/>
         </w:numPr>
       </w:pPr>
       <w:r>
@@ -6450,7 +5917,7 @@
         <w:pStyle w:val="Compact"/>
         <w:numPr>
           <w:ilvl w:val="0"/>
-          <w:numId w:val="1031"/>
+          <w:numId w:val="1020"/>
         </w:numPr>
       </w:pPr>
       <w:r>
@@ -6472,7 +5939,7 @@
         <w:pStyle w:val="Compact"/>
         <w:numPr>
           <w:ilvl w:val="0"/>
-          <w:numId w:val="1031"/>
+          <w:numId w:val="1020"/>
         </w:numPr>
       </w:pPr>
       <w:r>
@@ -6494,7 +5961,7 @@
         <w:pStyle w:val="Compact"/>
         <w:numPr>
           <w:ilvl w:val="0"/>
-          <w:numId w:val="1031"/>
+          <w:numId w:val="1020"/>
         </w:numPr>
       </w:pPr>
       <w:r>
@@ -6516,7 +5983,7 @@
         <w:pStyle w:val="Compact"/>
         <w:numPr>
           <w:ilvl w:val="0"/>
-          <w:numId w:val="1031"/>
+          <w:numId w:val="1020"/>
         </w:numPr>
       </w:pPr>
       <w:r>
@@ -6538,7 +6005,7 @@
         <w:pStyle w:val="Compact"/>
         <w:numPr>
           <w:ilvl w:val="0"/>
-          <w:numId w:val="1031"/>
+          <w:numId w:val="1020"/>
         </w:numPr>
       </w:pPr>
       <w:r>
@@ -6560,7 +6027,7 @@
         <w:pStyle w:val="Compact"/>
         <w:numPr>
           <w:ilvl w:val="0"/>
-          <w:numId w:val="1031"/>
+          <w:numId w:val="1020"/>
         </w:numPr>
       </w:pPr>
       <w:r>
@@ -6582,7 +6049,7 @@
         <w:pStyle w:val="Compact"/>
         <w:numPr>
           <w:ilvl w:val="0"/>
-          <w:numId w:val="1031"/>
+          <w:numId w:val="1020"/>
         </w:numPr>
       </w:pPr>
       <w:r>
@@ -6604,7 +6071,7 @@
         <w:pStyle w:val="Compact"/>
         <w:numPr>
           <w:ilvl w:val="0"/>
-          <w:numId w:val="1031"/>
+          <w:numId w:val="1020"/>
         </w:numPr>
       </w:pPr>
       <w:r>
@@ -6626,7 +6093,7 @@
         <w:pStyle w:val="Compact"/>
         <w:numPr>
           <w:ilvl w:val="0"/>
-          <w:numId w:val="1031"/>
+          <w:numId w:val="1020"/>
         </w:numPr>
       </w:pPr>
       <w:r>
@@ -6648,7 +6115,7 @@
         <w:pStyle w:val="Compact"/>
         <w:numPr>
           <w:ilvl w:val="0"/>
-          <w:numId w:val="1031"/>
+          <w:numId w:val="1020"/>
         </w:numPr>
       </w:pPr>
       <w:r>
@@ -6672,13 +6139,22 @@
         </w:pict>
       </w:r>
     </w:p>
-    <w:bookmarkEnd w:id="59"/>
-    <w:bookmarkEnd w:id="60"/>
-    <w:bookmarkStart w:id="61" w:name="X58b96fdaed12f43119e917314145c6363d4f30b"/>
+    <w:bookmarkEnd w:id="48"/>
+    <w:bookmarkEnd w:id="49"/>
+    <w:bookmarkStart w:id="50" w:name="X58b96fdaed12f43119e917314145c6363d4f30b"/>
     <w:p>
       <w:pPr>
         <w:pStyle w:val="Heading2"/>
       </w:pPr>
+      <w:r>
+        <w:rPr>
+          <w:rStyle w:val="SectionNumber"/>
+        </w:rPr>
+        <w:t xml:space="preserve">1.17</w:t>
+      </w:r>
+      <w:r>
+        <w:tab/>
+      </w:r>
       <w:r>
         <w:t xml:space="preserve">Step 5. Synthesis pass (mandatory before writing to disk)</w:t>
       </w:r>
@@ -6696,7 +6172,7 @@
         <w:pStyle w:val="Compact"/>
         <w:numPr>
           <w:ilvl w:val="0"/>
-          <w:numId w:val="1032"/>
+          <w:numId w:val="1021"/>
         </w:numPr>
       </w:pPr>
       <w:r>
@@ -6708,7 +6184,7 @@
         <w:pStyle w:val="Compact"/>
         <w:numPr>
           <w:ilvl w:val="0"/>
-          <w:numId w:val="1032"/>
+          <w:numId w:val="1021"/>
         </w:numPr>
       </w:pPr>
       <w:r>
@@ -6720,7 +6196,7 @@
         <w:pStyle w:val="Compact"/>
         <w:numPr>
           <w:ilvl w:val="0"/>
-          <w:numId w:val="1032"/>
+          <w:numId w:val="1021"/>
         </w:numPr>
       </w:pPr>
       <w:r>
@@ -6732,7 +6208,7 @@
         <w:pStyle w:val="Compact"/>
         <w:numPr>
           <w:ilvl w:val="0"/>
-          <w:numId w:val="1032"/>
+          <w:numId w:val="1021"/>
         </w:numPr>
       </w:pPr>
       <w:r>
@@ -6744,7 +6220,7 @@
         <w:pStyle w:val="Compact"/>
         <w:numPr>
           <w:ilvl w:val="0"/>
-          <w:numId w:val="1032"/>
+          <w:numId w:val="1021"/>
         </w:numPr>
       </w:pPr>
       <w:r>
@@ -6936,12 +6412,21 @@
         </w:pict>
       </w:r>
     </w:p>
-    <w:bookmarkEnd w:id="61"/>
-    <w:bookmarkStart w:id="62" w:name="Xb22db147f72de56425655a4611f6cbddfc0fd43"/>
+    <w:bookmarkEnd w:id="50"/>
+    <w:bookmarkStart w:id="51" w:name="Xb22db147f72de56425655a4611f6cbddfc0fd43"/>
     <w:p>
       <w:pPr>
         <w:pStyle w:val="Heading2"/>
       </w:pPr>
+      <w:r>
+        <w:rPr>
+          <w:rStyle w:val="SectionNumber"/>
+        </w:rPr>
+        <w:t xml:space="preserve">1.18</w:t>
+      </w:r>
+      <w:r>
+        <w:tab/>
+      </w:r>
       <w:r>
         <w:t xml:space="preserve">Step 6. Voice enforcement gate (mandatory before writing)</w:t>
       </w:r>
@@ -7378,12 +6863,21 @@
         </w:pict>
       </w:r>
     </w:p>
-    <w:bookmarkEnd w:id="62"/>
-    <w:bookmarkStart w:id="63" w:name="step-7.-write-outputs"/>
+    <w:bookmarkEnd w:id="51"/>
+    <w:bookmarkStart w:id="52" w:name="step-7.-write-outputs"/>
     <w:p>
       <w:pPr>
         <w:pStyle w:val="Heading2"/>
       </w:pPr>
+      <w:r>
+        <w:rPr>
+          <w:rStyle w:val="SectionNumber"/>
+        </w:rPr>
+        <w:t xml:space="preserve">1.19</w:t>
+      </w:r>
+      <w:r>
+        <w:tab/>
+      </w:r>
       <w:r>
         <w:t xml:space="preserve">Step 7. Write outputs</w:t>
       </w:r>
@@ -7855,12 +7349,21 @@
         </w:pict>
       </w:r>
     </w:p>
-    <w:bookmarkEnd w:id="63"/>
-    <w:bookmarkStart w:id="64" w:name="step-8.-merge-into-actions.md"/>
+    <w:bookmarkEnd w:id="52"/>
+    <w:bookmarkStart w:id="53" w:name="step-8.-merge-into-actions.md"/>
     <w:p>
       <w:pPr>
         <w:pStyle w:val="Heading2"/>
       </w:pPr>
+      <w:r>
+        <w:rPr>
+          <w:rStyle w:val="SectionNumber"/>
+        </w:rPr>
+        <w:t xml:space="preserve">1.20</w:t>
+      </w:r>
+      <w:r>
+        <w:tab/>
+      </w:r>
       <w:r>
         <w:t xml:space="preserve">Step 8. Merge into actions.md</w:t>
       </w:r>
@@ -7892,12 +7395,21 @@
         </w:pict>
       </w:r>
     </w:p>
-    <w:bookmarkEnd w:id="64"/>
-    <w:bookmarkStart w:id="65" w:name="step-9.-commit-optional"/>
+    <w:bookmarkEnd w:id="53"/>
+    <w:bookmarkStart w:id="54" w:name="step-9.-commit-optional"/>
     <w:p>
       <w:pPr>
         <w:pStyle w:val="Heading2"/>
       </w:pPr>
+      <w:r>
+        <w:rPr>
+          <w:rStyle w:val="SectionNumber"/>
+        </w:rPr>
+        <w:t xml:space="preserve">1.21</w:t>
+      </w:r>
+      <w:r>
+        <w:tab/>
+      </w:r>
       <w:r>
         <w:t xml:space="preserve">Step 9. Commit (optional)</w:t>
       </w:r>
@@ -7928,12 +7440,21 @@
         </w:pict>
       </w:r>
     </w:p>
-    <w:bookmarkEnd w:id="65"/>
-    <w:bookmarkStart w:id="66" w:name="voice-conventions-strict"/>
+    <w:bookmarkEnd w:id="54"/>
+    <w:bookmarkStart w:id="55" w:name="voice-conventions-strict"/>
     <w:p>
       <w:pPr>
         <w:pStyle w:val="Heading2"/>
       </w:pPr>
+      <w:r>
+        <w:rPr>
+          <w:rStyle w:val="SectionNumber"/>
+        </w:rPr>
+        <w:t xml:space="preserve">1.22</w:t>
+      </w:r>
+      <w:r>
+        <w:tab/>
+      </w:r>
       <w:r>
         <w:t xml:space="preserve">Voice conventions (strict)</w:t>
       </w:r>
@@ -7943,7 +7464,7 @@
         <w:pStyle w:val="Compact"/>
         <w:numPr>
           <w:ilvl w:val="0"/>
-          <w:numId w:val="1033"/>
+          <w:numId w:val="1022"/>
         </w:numPr>
       </w:pPr>
       <w:r>
@@ -7955,7 +7476,7 @@
         <w:pStyle w:val="Compact"/>
         <w:numPr>
           <w:ilvl w:val="0"/>
-          <w:numId w:val="1033"/>
+          <w:numId w:val="1022"/>
         </w:numPr>
       </w:pPr>
       <w:r>
@@ -7967,7 +7488,7 @@
         <w:pStyle w:val="Compact"/>
         <w:numPr>
           <w:ilvl w:val="0"/>
-          <w:numId w:val="1033"/>
+          <w:numId w:val="1022"/>
         </w:numPr>
       </w:pPr>
       <w:r>
@@ -7979,7 +7500,7 @@
         <w:pStyle w:val="Compact"/>
         <w:numPr>
           <w:ilvl w:val="0"/>
-          <w:numId w:val="1033"/>
+          <w:numId w:val="1022"/>
         </w:numPr>
       </w:pPr>
       <w:r>
@@ -7997,7 +7518,7 @@
         <w:pStyle w:val="Compact"/>
         <w:numPr>
           <w:ilvl w:val="0"/>
-          <w:numId w:val="1033"/>
+          <w:numId w:val="1022"/>
         </w:numPr>
       </w:pPr>
       <w:r>
@@ -8009,7 +7530,7 @@
         <w:pStyle w:val="Compact"/>
         <w:numPr>
           <w:ilvl w:val="0"/>
-          <w:numId w:val="1033"/>
+          <w:numId w:val="1022"/>
         </w:numPr>
       </w:pPr>
       <w:r>
@@ -8021,7 +7542,7 @@
         <w:pStyle w:val="Compact"/>
         <w:numPr>
           <w:ilvl w:val="0"/>
-          <w:numId w:val="1033"/>
+          <w:numId w:val="1022"/>
         </w:numPr>
       </w:pPr>
       <w:r>
@@ -8035,12 +7556,21 @@
         </w:pict>
       </w:r>
     </w:p>
-    <w:bookmarkEnd w:id="66"/>
-    <w:bookmarkStart w:id="67" w:name="acceptance-criteria"/>
+    <w:bookmarkEnd w:id="55"/>
+    <w:bookmarkStart w:id="56" w:name="acceptance-criteria"/>
     <w:p>
       <w:pPr>
         <w:pStyle w:val="Heading2"/>
       </w:pPr>
+      <w:r>
+        <w:rPr>
+          <w:rStyle w:val="SectionNumber"/>
+        </w:rPr>
+        <w:t xml:space="preserve">1.23</w:t>
+      </w:r>
+      <w:r>
+        <w:tab/>
+      </w:r>
       <w:r>
         <w:t xml:space="preserve">Acceptance criteria</w:t>
       </w:r>
@@ -8050,7 +7580,7 @@
         <w:pStyle w:val="Compact"/>
         <w:numPr>
           <w:ilvl w:val="0"/>
-          <w:numId w:val="1034"/>
+          <w:numId w:val="1023"/>
         </w:numPr>
       </w:pPr>
       <w:r>
@@ -8062,7 +7592,7 @@
         <w:pStyle w:val="Compact"/>
         <w:numPr>
           <w:ilvl w:val="0"/>
-          <w:numId w:val="1034"/>
+          <w:numId w:val="1023"/>
         </w:numPr>
       </w:pPr>
       <w:r>
@@ -8074,7 +7604,7 @@
         <w:pStyle w:val="Compact"/>
         <w:numPr>
           <w:ilvl w:val="0"/>
-          <w:numId w:val="1034"/>
+          <w:numId w:val="1023"/>
         </w:numPr>
       </w:pPr>
       <w:r>
@@ -8086,7 +7616,7 @@
         <w:pStyle w:val="Compact"/>
         <w:numPr>
           <w:ilvl w:val="0"/>
-          <w:numId w:val="1034"/>
+          <w:numId w:val="1023"/>
         </w:numPr>
       </w:pPr>
       <w:r>
@@ -8098,7 +7628,7 @@
         <w:pStyle w:val="Compact"/>
         <w:numPr>
           <w:ilvl w:val="0"/>
-          <w:numId w:val="1034"/>
+          <w:numId w:val="1023"/>
         </w:numPr>
       </w:pPr>
       <w:r>
@@ -8110,7 +7640,7 @@
         <w:pStyle w:val="Compact"/>
         <w:numPr>
           <w:ilvl w:val="0"/>
-          <w:numId w:val="1034"/>
+          <w:numId w:val="1023"/>
         </w:numPr>
       </w:pPr>
       <w:r>
@@ -8122,7 +7652,7 @@
         <w:pStyle w:val="Compact"/>
         <w:numPr>
           <w:ilvl w:val="0"/>
-          <w:numId w:val="1034"/>
+          <w:numId w:val="1023"/>
         </w:numPr>
       </w:pPr>
       <w:r>
@@ -8136,13 +7666,22 @@
         </w:pict>
       </w:r>
     </w:p>
-    <w:bookmarkEnd w:id="67"/>
-    <w:bookmarkStart w:id="68" w:name="what-to-do-with-the-output"/>
+    <w:bookmarkEnd w:id="56"/>
+    <w:bookmarkStart w:id="57" w:name="what-to-do-with-the-output"/>
     <w:p>
       <w:pPr>
         <w:pStyle w:val="Heading2"/>
       </w:pPr>
       <w:r>
+        <w:rPr>
+          <w:rStyle w:val="SectionNumber"/>
+        </w:rPr>
+        <w:t xml:space="preserve">1.24</w:t>
+      </w:r>
+      <w:r>
+        <w:tab/>
+      </w:r>
+      <w:r>
         <w:t xml:space="preserve">What to do with the output</w:t>
       </w:r>
     </w:p>
@@ -8162,8 +7701,8 @@
         <w:t xml:space="preserve">Want this run for you on a live engagement with a weekly review cadence, a daily dashboard, and the thirty-plus downstream playbooks across every GTM function? Book a call at https://entirecommerce.ai/audit.</w:t>
       </w:r>
     </w:p>
-    <w:bookmarkEnd w:id="68"/>
-    <w:bookmarkEnd w:id="69"/>
+    <w:bookmarkEnd w:id="57"/>
+    <w:bookmarkEnd w:id="58"/>
     <w:sectPr>
       <w:footnotePr>
         <w:numRestart w:val="eachSect"/>
@@ -8650,39 +8189,6 @@
     <w:abstractNumId w:val="991"/>
   </w:num>
   <w:num w:numId="1019">
-    <w:abstractNumId w:val="991"/>
-  </w:num>
-  <w:num w:numId="1020">
-    <w:abstractNumId w:val="991"/>
-  </w:num>
-  <w:num w:numId="1021">
-    <w:abstractNumId w:val="991"/>
-  </w:num>
-  <w:num w:numId="1022">
-    <w:abstractNumId w:val="991"/>
-  </w:num>
-  <w:num w:numId="1023">
-    <w:abstractNumId w:val="991"/>
-  </w:num>
-  <w:num w:numId="1024">
-    <w:abstractNumId w:val="991"/>
-  </w:num>
-  <w:num w:numId="1025">
-    <w:abstractNumId w:val="991"/>
-  </w:num>
-  <w:num w:numId="1026">
-    <w:abstractNumId w:val="991"/>
-  </w:num>
-  <w:num w:numId="1027">
-    <w:abstractNumId w:val="991"/>
-  </w:num>
-  <w:num w:numId="1028">
-    <w:abstractNumId w:val="991"/>
-  </w:num>
-  <w:num w:numId="1029">
-    <w:abstractNumId w:val="991"/>
-  </w:num>
-  <w:num w:numId="1030">
     <w:abstractNumId w:val="99411"/>
     <w:lvlOverride w:ilvl="0">
       <w:startOverride w:val="1"/>
@@ -8712,7 +8218,7 @@
       <w:startOverride w:val="1"/>
     </w:lvlOverride>
   </w:num>
-  <w:num w:numId="1031">
+  <w:num w:numId="1020">
     <w:abstractNumId w:val="99411"/>
     <w:lvlOverride w:ilvl="0">
       <w:startOverride w:val="1"/>
@@ -8742,13 +8248,13 @@
       <w:startOverride w:val="1"/>
     </w:lvlOverride>
   </w:num>
-  <w:num w:numId="1032">
+  <w:num w:numId="1021">
     <w:abstractNumId w:val="991"/>
   </w:num>
-  <w:num w:numId="1033">
+  <w:num w:numId="1022">
     <w:abstractNumId w:val="991"/>
   </w:num>
-  <w:num w:numId="1034">
+  <w:num w:numId="1023">
     <w:abstractNumId w:val="991"/>
   </w:num>
 </w:numbering>

</xml_diff>